<commit_message>
Update scientific evidence library with concise sourced claims
</commit_message>
<xml_diff>
--- a/docs/scientific-evidence-library.docx
+++ b/docs/scientific-evidence-library.docx
@@ -2600,7 +2600,7 @@
           <w:szCs w:val="16"/>
           <w:rtl w:val="0"/>
         </w:rPr>
-        <w:t xml:space="preserve">Source: Quek et al., Nutrition Journal (2023)</w:t>
+        <w:t xml:space="preserve">Source: Wang et al., Nutrition Journal (2023)</w:t>
       </w:r>
       <w:r>
         <w:rPr>
@@ -2671,7 +2671,7 @@
           <w:szCs w:val="16"/>
           <w:rtl w:val="0"/>
         </w:rPr>
-        <w:t xml:space="preserve">Source: Quek et al., Nutrition Journal (2023)</w:t>
+        <w:t xml:space="preserve">Source: Wang et al., Nutrition Journal (2023)</w:t>
       </w:r>
       <w:r>
         <w:rPr>
@@ -3563,7 +3563,7 @@
           <w:szCs w:val="19"/>
           <w:rtl w:val="0"/>
         </w:rPr>
-        <w:t xml:space="preserve">🐟 Fish sentience: 349 papers | 142 species + subspecies reviewed</w:t>
+        <w:t xml:space="preserve">🐟 Fish sentience: 349 articles | 470 results | 142 species + subspecies</w:t>
       </w:r>
       <w:r>
         <w:rPr>
@@ -5643,7 +5643,6 @@
     <w:pPr>
       <w:keepNext w:val="0"/>
       <w:keepLines w:val="0"/>
-      <w:pageBreakBefore w:val="0"/>
       <w:widowControl w:val="1"/>
       <w:pBdr>
         <w:top w:space="0" w:sz="0" w:val="nil"/>

</xml_diff>

<commit_message>
Update scientific evidence library and add key definitions
</commit_message>
<xml_diff>
--- a/docs/scientific-evidence-library.docx
+++ b/docs/scientific-evidence-library.docx
@@ -2943,7 +2943,7 @@
         <w:rPr>
           <w:rtl w:val="0"/>
         </w:rPr>
-        <w:t xml:space="preserve">Type 2 Diabetes</w:t>
+        <w:t xml:space="preserve">Meat Consumption &amp; Common Conditions</w:t>
       </w:r>
     </w:p>
     <w:p>
@@ -2959,7 +2959,7 @@
           <w:szCs w:val="19"/>
           <w:rtl w:val="0"/>
         </w:rPr>
-        <w:t xml:space="preserve">🥩 Higher red-meat intake: associated with higher Type 2 diabetes risk</w:t>
+        <w:t xml:space="preserve">🥩 Red + processed meat: +70 g/day associated with ~15% higher IHD | ~31% pneumonia | ~19% diverticular disease | ~10% colon polyps | ~30% diabetes</w:t>
       </w:r>
       <w:r>
         <w:rPr>
@@ -2979,7 +2979,7 @@
           <w:szCs w:val="16"/>
           <w:rtl w:val="0"/>
         </w:rPr>
-        <w:t xml:space="preserve">Source: Gu et al., American Journal of Clinical Nutrition (2023)</w:t>
+        <w:t xml:space="preserve">Source: Papier et al., BMC Medicine (2021)</w:t>
       </w:r>
       <w:r>
         <w:rPr>
@@ -3002,6 +3002,261 @@
         <w:t xml:space="preserve">URL: </w:t>
       </w:r>
       <w:hyperlink r:id="rId45">
+        <w:r>
+          <w:rPr>
+            <w:color w:val="1155cc"/>
+            <w:sz w:val="16"/>
+            <w:szCs w:val="16"/>
+            <w:u w:val="single"/>
+            <w:rtl w:val="0"/>
+          </w:rPr>
+          <w:t xml:space="preserve">https://doi.org/10.1186/s12916-021-01922-9</w:t>
+        </w:r>
+      </w:hyperlink>
+      <w:r>
+        <w:rPr>
+          <w:sz w:val="16"/>
+          <w:szCs w:val="16"/>
+          <w:rtl w:val="0"/>
+        </w:rPr>
+        <w:t xml:space="preserve"> </w:t>
+      </w:r>
+      <w:r>
+        <w:rPr>
+          <w:rtl w:val="0"/>
+        </w:rPr>
+      </w:r>
+    </w:p>
+    <w:p>
+      <w:pPr>
+        <w:spacing w:after="20" w:before="100" w:lineRule="auto"/>
+        <w:rPr/>
+      </w:pPr>
+      <w:r>
+        <w:rPr>
+          <w:b w:val="1"/>
+          <w:bCs w:val="1"/>
+          <w:sz w:val="19"/>
+          <w:szCs w:val="19"/>
+          <w:rtl w:val="0"/>
+        </w:rPr>
+        <w:t xml:space="preserve">🐔 Poultry: +30 g/day associated with ~17% higher GERD | ~12% gastritis/duodenitis | ~10% diverticular disease | ~11% gallbladder disease | ~14% diabetes</w:t>
+      </w:r>
+      <w:r>
+        <w:rPr>
+          <w:rtl w:val="0"/>
+        </w:rPr>
+      </w:r>
+    </w:p>
+    <w:p>
+      <w:pPr>
+        <w:spacing w:after="0" w:lineRule="auto"/>
+        <w:ind w:left="173" w:firstLine="0"/>
+        <w:rPr/>
+      </w:pPr>
+      <w:r>
+        <w:rPr>
+          <w:sz w:val="16"/>
+          <w:szCs w:val="16"/>
+          <w:rtl w:val="0"/>
+        </w:rPr>
+        <w:t xml:space="preserve">Source: Papier et al., BMC Medicine (2021)</w:t>
+      </w:r>
+      <w:r>
+        <w:rPr>
+          <w:rtl w:val="0"/>
+        </w:rPr>
+      </w:r>
+    </w:p>
+    <w:p>
+      <w:pPr>
+        <w:spacing w:after="20" w:lineRule="auto"/>
+        <w:ind w:left="173" w:firstLine="0"/>
+        <w:rPr/>
+      </w:pPr>
+      <w:r>
+        <w:rPr>
+          <w:sz w:val="16"/>
+          <w:szCs w:val="16"/>
+          <w:rtl w:val="0"/>
+        </w:rPr>
+        <w:t xml:space="preserve">URL: </w:t>
+      </w:r>
+      <w:hyperlink r:id="rId46">
+        <w:r>
+          <w:rPr>
+            <w:color w:val="1155cc"/>
+            <w:sz w:val="16"/>
+            <w:szCs w:val="16"/>
+            <w:u w:val="single"/>
+            <w:rtl w:val="0"/>
+          </w:rPr>
+          <w:t xml:space="preserve">https://doi.org/10.1186/s12916-021-01922-9</w:t>
+        </w:r>
+      </w:hyperlink>
+      <w:r>
+        <w:rPr>
+          <w:sz w:val="16"/>
+          <w:szCs w:val="16"/>
+          <w:rtl w:val="0"/>
+        </w:rPr>
+        <w:t xml:space="preserve"> </w:t>
+      </w:r>
+      <w:r>
+        <w:rPr>
+          <w:rtl w:val="0"/>
+        </w:rPr>
+      </w:r>
+    </w:p>
+    <w:p>
+      <w:pPr>
+        <w:spacing w:after="20" w:before="100" w:lineRule="auto"/>
+        <w:rPr/>
+      </w:pPr>
+      <w:r>
+        <w:rPr>
+          <w:b w:val="1"/>
+          <w:bCs w:val="1"/>
+          <w:sz w:val="19"/>
+          <w:szCs w:val="19"/>
+          <w:rtl w:val="0"/>
+        </w:rPr>
+        <w:t xml:space="preserve">🩸 Higher unprocessed red meat + poultry: associated with lower iron-deficiency anemia risk</w:t>
+      </w:r>
+      <w:r>
+        <w:rPr>
+          <w:rtl w:val="0"/>
+        </w:rPr>
+      </w:r>
+    </w:p>
+    <w:p>
+      <w:pPr>
+        <w:spacing w:after="0" w:lineRule="auto"/>
+        <w:ind w:left="173" w:firstLine="0"/>
+        <w:rPr/>
+      </w:pPr>
+      <w:r>
+        <w:rPr>
+          <w:sz w:val="16"/>
+          <w:szCs w:val="16"/>
+          <w:rtl w:val="0"/>
+        </w:rPr>
+        <w:t xml:space="preserve">Source: Papier et al., BMC Medicine (2021)</w:t>
+      </w:r>
+      <w:r>
+        <w:rPr>
+          <w:rtl w:val="0"/>
+        </w:rPr>
+      </w:r>
+    </w:p>
+    <w:p>
+      <w:pPr>
+        <w:spacing w:after="20" w:lineRule="auto"/>
+        <w:ind w:left="173" w:firstLine="0"/>
+        <w:rPr/>
+      </w:pPr>
+      <w:r>
+        <w:rPr>
+          <w:sz w:val="16"/>
+          <w:szCs w:val="16"/>
+          <w:rtl w:val="0"/>
+        </w:rPr>
+        <w:t xml:space="preserve">URL: </w:t>
+      </w:r>
+      <w:hyperlink r:id="rId47">
+        <w:r>
+          <w:rPr>
+            <w:color w:val="1155cc"/>
+            <w:sz w:val="16"/>
+            <w:szCs w:val="16"/>
+            <w:u w:val="single"/>
+            <w:rtl w:val="0"/>
+          </w:rPr>
+          <w:t xml:space="preserve">https://doi.org/10.1186/s12916-021-01922-9</w:t>
+        </w:r>
+      </w:hyperlink>
+      <w:r>
+        <w:rPr>
+          <w:sz w:val="16"/>
+          <w:szCs w:val="16"/>
+          <w:rtl w:val="0"/>
+        </w:rPr>
+        <w:t xml:space="preserve"> </w:t>
+      </w:r>
+      <w:r>
+        <w:rPr>
+          <w:rtl w:val="0"/>
+        </w:rPr>
+      </w:r>
+    </w:p>
+    <w:p>
+      <w:pPr>
+        <w:pStyle w:val="Heading2"/>
+        <w:rPr/>
+      </w:pPr>
+      <w:r>
+        <w:rPr>
+          <w:rtl w:val="0"/>
+        </w:rPr>
+        <w:t xml:space="preserve">Type 2 Diabetes</w:t>
+      </w:r>
+    </w:p>
+    <w:p>
+      <w:pPr>
+        <w:spacing w:after="20" w:before="100" w:lineRule="auto"/>
+        <w:rPr/>
+      </w:pPr>
+      <w:r>
+        <w:rPr>
+          <w:b w:val="1"/>
+          <w:bCs w:val="1"/>
+          <w:sz w:val="19"/>
+          <w:szCs w:val="19"/>
+          <w:rtl w:val="0"/>
+        </w:rPr>
+        <w:t xml:space="preserve">🥩 Higher red-meat intake: associated with higher Type 2 diabetes risk</w:t>
+      </w:r>
+      <w:r>
+        <w:rPr>
+          <w:rtl w:val="0"/>
+        </w:rPr>
+      </w:r>
+    </w:p>
+    <w:p>
+      <w:pPr>
+        <w:spacing w:after="0" w:lineRule="auto"/>
+        <w:ind w:left="173" w:firstLine="0"/>
+        <w:rPr/>
+      </w:pPr>
+      <w:r>
+        <w:rPr>
+          <w:sz w:val="16"/>
+          <w:szCs w:val="16"/>
+          <w:rtl w:val="0"/>
+        </w:rPr>
+        <w:t xml:space="preserve">Source: Gu et al., American Journal of Clinical Nutrition (2023)</w:t>
+      </w:r>
+      <w:r>
+        <w:rPr>
+          <w:rtl w:val="0"/>
+        </w:rPr>
+      </w:r>
+    </w:p>
+    <w:p>
+      <w:pPr>
+        <w:spacing w:after="20" w:lineRule="auto"/>
+        <w:ind w:left="173" w:firstLine="0"/>
+        <w:rPr/>
+      </w:pPr>
+      <w:r>
+        <w:rPr>
+          <w:sz w:val="16"/>
+          <w:szCs w:val="16"/>
+          <w:rtl w:val="0"/>
+        </w:rPr>
+        <w:t xml:space="preserve">URL: </w:t>
+      </w:r>
+      <w:hyperlink r:id="rId48">
         <w:r>
           <w:rPr>
             <w:color w:val="0563c1"/>
@@ -3084,7 +3339,7 @@
         </w:rPr>
         <w:t xml:space="preserve">URL: </w:t>
       </w:r>
-      <w:hyperlink r:id="rId46">
+      <w:hyperlink r:id="rId49">
         <w:r>
           <w:rPr>
             <w:color w:val="0563c1"/>
@@ -3167,7 +3422,7 @@
         </w:rPr>
         <w:t xml:space="preserve">URL: </w:t>
       </w:r>
-      <w:hyperlink r:id="rId47">
+      <w:hyperlink r:id="rId50">
         <w:r>
           <w:rPr>
             <w:color w:val="0563c1"/>
@@ -3238,7 +3493,7 @@
         </w:rPr>
         <w:t xml:space="preserve">URL: </w:t>
       </w:r>
-      <w:hyperlink r:id="rId48">
+      <w:hyperlink r:id="rId51">
         <w:r>
           <w:rPr>
             <w:color w:val="0563c1"/>
@@ -3309,7 +3564,7 @@
         </w:rPr>
         <w:t xml:space="preserve">URL: </w:t>
       </w:r>
-      <w:hyperlink r:id="rId49">
+      <w:hyperlink r:id="rId52">
         <w:r>
           <w:rPr>
             <w:color w:val="0563c1"/>
@@ -3380,7 +3635,7 @@
         </w:rPr>
         <w:t xml:space="preserve">URL: </w:t>
       </w:r>
-      <w:hyperlink r:id="rId50">
+      <w:hyperlink r:id="rId53">
         <w:r>
           <w:rPr>
             <w:color w:val="0563c1"/>
@@ -3451,7 +3706,7 @@
         </w:rPr>
         <w:t xml:space="preserve">URL: </w:t>
       </w:r>
-      <w:hyperlink r:id="rId51">
+      <w:hyperlink r:id="rId54">
         <w:r>
           <w:rPr>
             <w:color w:val="0563c1"/>
@@ -3534,7 +3789,7 @@
         </w:rPr>
         <w:t xml:space="preserve">URL: </w:t>
       </w:r>
-      <w:hyperlink r:id="rId52">
+      <w:hyperlink r:id="rId55">
         <w:r>
           <w:rPr>
             <w:color w:val="0563c1"/>
@@ -3605,7 +3860,7 @@
         </w:rPr>
         <w:t xml:space="preserve">URL: </w:t>
       </w:r>
-      <w:hyperlink r:id="rId53">
+      <w:hyperlink r:id="rId56">
         <w:r>
           <w:rPr>
             <w:color w:val="0563c1"/>
@@ -3696,7 +3951,7 @@
         </w:rPr>
         <w:t xml:space="preserve">URL: </w:t>
       </w:r>
-      <w:hyperlink r:id="rId54">
+      <w:hyperlink r:id="rId57">
         <w:r>
           <w:rPr>
             <w:color w:val="0563c1"/>
@@ -3726,7 +3981,7 @@
         </w:rPr>
         <w:t xml:space="preserve">URL: </w:t>
       </w:r>
-      <w:hyperlink r:id="rId55">
+      <w:hyperlink r:id="rId58">
         <w:r>
           <w:rPr>
             <w:color w:val="0563c1"/>
@@ -3797,7 +4052,7 @@
         </w:rPr>
         <w:t xml:space="preserve">URL: </w:t>
       </w:r>
-      <w:hyperlink r:id="rId56">
+      <w:hyperlink r:id="rId59">
         <w:r>
           <w:rPr>
             <w:color w:val="0563c1"/>
@@ -3868,7 +4123,7 @@
         </w:rPr>
         <w:t xml:space="preserve">URL: </w:t>
       </w:r>
-      <w:hyperlink r:id="rId57">
+      <w:hyperlink r:id="rId60">
         <w:r>
           <w:rPr>
             <w:color w:val="0563c1"/>
@@ -3979,7 +4234,7 @@
         </w:rPr>
         <w:t xml:space="preserve">URL: </w:t>
       </w:r>
-      <w:hyperlink r:id="rId58">
+      <w:hyperlink r:id="rId61">
         <w:r>
           <w:rPr>
             <w:color w:val="0563c1"/>
@@ -4009,7 +4264,7 @@
         </w:rPr>
         <w:t xml:space="preserve">URL: </w:t>
       </w:r>
-      <w:hyperlink r:id="rId59">
+      <w:hyperlink r:id="rId62">
         <w:r>
           <w:rPr>
             <w:color w:val="0563c1"/>
@@ -4039,7 +4294,7 @@
         </w:rPr>
         <w:t xml:space="preserve">URL: </w:t>
       </w:r>
-      <w:hyperlink r:id="rId60">
+      <w:hyperlink r:id="rId63">
         <w:r>
           <w:rPr>
             <w:color w:val="0563c1"/>
@@ -4110,7 +4365,7 @@
         </w:rPr>
         <w:t xml:space="preserve">URL: </w:t>
       </w:r>
-      <w:hyperlink r:id="rId61">
+      <w:hyperlink r:id="rId64">
         <w:r>
           <w:rPr>
             <w:color w:val="0563c1"/>
@@ -4181,7 +4436,7 @@
         </w:rPr>
         <w:t xml:space="preserve">URL: </w:t>
       </w:r>
-      <w:hyperlink r:id="rId62">
+      <w:hyperlink r:id="rId65">
         <w:r>
           <w:rPr>
             <w:color w:val="0563c1"/>
@@ -4252,7 +4507,7 @@
         </w:rPr>
         <w:t xml:space="preserve">URL: </w:t>
       </w:r>
-      <w:hyperlink r:id="rId63">
+      <w:hyperlink r:id="rId66">
         <w:r>
           <w:rPr>
             <w:color w:val="0563c1"/>
@@ -4323,7 +4578,7 @@
         </w:rPr>
         <w:t xml:space="preserve">URL: </w:t>
       </w:r>
-      <w:hyperlink r:id="rId64">
+      <w:hyperlink r:id="rId67">
         <w:r>
           <w:rPr>
             <w:color w:val="0563c1"/>
@@ -4365,219 +4620,6 @@
           <w:rtl w:val="0"/>
         </w:rPr>
         <w:t xml:space="preserve">🐄 Farm animals: pain | fear | distress</w:t>
-      </w:r>
-      <w:r>
-        <w:rPr>
-          <w:rtl w:val="0"/>
-        </w:rPr>
-      </w:r>
-    </w:p>
-    <w:p>
-      <w:pPr>
-        <w:spacing w:after="0" w:lineRule="auto"/>
-        <w:ind w:left="173" w:firstLine="0"/>
-        <w:rPr/>
-      </w:pPr>
-      <w:r>
-        <w:rPr>
-          <w:sz w:val="16"/>
-          <w:szCs w:val="16"/>
-          <w:rtl w:val="0"/>
-        </w:rPr>
-        <w:t xml:space="preserve">Source: European Food Safety Authority</w:t>
-      </w:r>
-      <w:r>
-        <w:rPr>
-          <w:rtl w:val="0"/>
-        </w:rPr>
-      </w:r>
-    </w:p>
-    <w:p>
-      <w:pPr>
-        <w:spacing w:after="20" w:lineRule="auto"/>
-        <w:ind w:left="173" w:firstLine="0"/>
-        <w:rPr/>
-      </w:pPr>
-      <w:r>
-        <w:rPr>
-          <w:sz w:val="16"/>
-          <w:szCs w:val="16"/>
-          <w:rtl w:val="0"/>
-        </w:rPr>
-        <w:t xml:space="preserve">URL: </w:t>
-      </w:r>
-      <w:hyperlink r:id="rId65">
-        <w:r>
-          <w:rPr>
-            <w:color w:val="0563c1"/>
-            <w:u w:val="single"/>
-            <w:rtl w:val="0"/>
-          </w:rPr>
-          <w:t xml:space="preserve">https://www.efsa.europa.eu/en/topics/topic/animal-welfare</w:t>
-        </w:r>
-      </w:hyperlink>
-      <w:r>
-        <w:rPr>
-          <w:rtl w:val="0"/>
-        </w:rPr>
-      </w:r>
-    </w:p>
-    <w:p>
-      <w:pPr>
-        <w:spacing w:after="20" w:before="100" w:lineRule="auto"/>
-        <w:rPr/>
-      </w:pPr>
-      <w:r>
-        <w:rPr>
-          <w:b w:val="1"/>
-          <w:bCs w:val="1"/>
-          <w:sz w:val="19"/>
-          <w:szCs w:val="19"/>
-          <w:rtl w:val="0"/>
-        </w:rPr>
-        <w:t xml:space="preserve">🚚 Animal transport: heat stress | thirst | fatigue</w:t>
-      </w:r>
-      <w:r>
-        <w:rPr>
-          <w:rtl w:val="0"/>
-        </w:rPr>
-      </w:r>
-    </w:p>
-    <w:p>
-      <w:pPr>
-        <w:spacing w:after="0" w:lineRule="auto"/>
-        <w:ind w:left="173" w:firstLine="0"/>
-        <w:rPr/>
-      </w:pPr>
-      <w:r>
-        <w:rPr>
-          <w:sz w:val="16"/>
-          <w:szCs w:val="16"/>
-          <w:rtl w:val="0"/>
-        </w:rPr>
-        <w:t xml:space="preserve">Source: European Food Safety Authority</w:t>
-      </w:r>
-      <w:r>
-        <w:rPr>
-          <w:rtl w:val="0"/>
-        </w:rPr>
-      </w:r>
-    </w:p>
-    <w:p>
-      <w:pPr>
-        <w:spacing w:after="20" w:lineRule="auto"/>
-        <w:ind w:left="173" w:firstLine="0"/>
-        <w:rPr/>
-      </w:pPr>
-      <w:r>
-        <w:rPr>
-          <w:sz w:val="16"/>
-          <w:szCs w:val="16"/>
-          <w:rtl w:val="0"/>
-        </w:rPr>
-        <w:t xml:space="preserve">URL: </w:t>
-      </w:r>
-      <w:hyperlink r:id="rId66">
-        <w:r>
-          <w:rPr>
-            <w:color w:val="0563c1"/>
-            <w:u w:val="single"/>
-            <w:rtl w:val="0"/>
-          </w:rPr>
-          <w:t xml:space="preserve">https://www.efsa.europa.eu/en/topics/topic/animal-welfare</w:t>
-        </w:r>
-      </w:hyperlink>
-      <w:r>
-        <w:rPr>
-          <w:rtl w:val="0"/>
-        </w:rPr>
-      </w:r>
-    </w:p>
-    <w:p>
-      <w:pPr>
-        <w:spacing w:after="20" w:before="100" w:lineRule="auto"/>
-        <w:rPr/>
-      </w:pPr>
-      <w:r>
-        <w:rPr>
-          <w:b w:val="1"/>
-          <w:bCs w:val="1"/>
-          <w:sz w:val="19"/>
-          <w:szCs w:val="19"/>
-          <w:rtl w:val="0"/>
-        </w:rPr>
-        <w:t xml:space="preserve">🐔 Some farming systems: restrict highly motivated natural behaviors</w:t>
-      </w:r>
-      <w:r>
-        <w:rPr>
-          <w:rtl w:val="0"/>
-        </w:rPr>
-      </w:r>
-    </w:p>
-    <w:p>
-      <w:pPr>
-        <w:spacing w:after="0" w:lineRule="auto"/>
-        <w:ind w:left="173" w:firstLine="0"/>
-        <w:rPr/>
-      </w:pPr>
-      <w:r>
-        <w:rPr>
-          <w:sz w:val="16"/>
-          <w:szCs w:val="16"/>
-          <w:rtl w:val="0"/>
-        </w:rPr>
-        <w:t xml:space="preserve">Source: European Food Safety Authority</w:t>
-      </w:r>
-      <w:r>
-        <w:rPr>
-          <w:rtl w:val="0"/>
-        </w:rPr>
-      </w:r>
-    </w:p>
-    <w:p>
-      <w:pPr>
-        <w:spacing w:after="20" w:lineRule="auto"/>
-        <w:ind w:left="173" w:firstLine="0"/>
-        <w:rPr/>
-      </w:pPr>
-      <w:r>
-        <w:rPr>
-          <w:sz w:val="16"/>
-          <w:szCs w:val="16"/>
-          <w:rtl w:val="0"/>
-        </w:rPr>
-        <w:t xml:space="preserve">URL: </w:t>
-      </w:r>
-      <w:hyperlink r:id="rId67">
-        <w:r>
-          <w:rPr>
-            <w:color w:val="0563c1"/>
-            <w:u w:val="single"/>
-            <w:rtl w:val="0"/>
-          </w:rPr>
-          <w:t xml:space="preserve">https://www.efsa.europa.eu/en/topics/topic/animal-welfare</w:t>
-        </w:r>
-      </w:hyperlink>
-      <w:r>
-        <w:rPr>
-          <w:rtl w:val="0"/>
-        </w:rPr>
-      </w:r>
-    </w:p>
-    <w:p>
-      <w:pPr>
-        <w:spacing w:after="20" w:before="100" w:lineRule="auto"/>
-        <w:rPr/>
-      </w:pPr>
-      <w:r>
-        <w:rPr>
-          <w:b w:val="1"/>
-          <w:bCs w:val="1"/>
-          <w:sz w:val="19"/>
-          <w:szCs w:val="19"/>
-          <w:rtl w:val="0"/>
-        </w:rPr>
-        <w:t xml:space="preserve">🐷 Commercial farming: can involve painful procedures</w:t>
       </w:r>
       <w:r>
         <w:rPr>
@@ -4637,18 +4679,6 @@
     </w:p>
     <w:p>
       <w:pPr>
-        <w:pStyle w:val="Heading1"/>
-        <w:rPr/>
-      </w:pPr>
-      <w:r>
-        <w:rPr>
-          <w:rtl w:val="0"/>
-        </w:rPr>
-        <w:t xml:space="preserve">8. FISHING &amp; AQUACULTURE</w:t>
-      </w:r>
-    </w:p>
-    <w:p>
-      <w:pPr>
         <w:spacing w:after="20" w:before="100" w:lineRule="auto"/>
         <w:rPr/>
       </w:pPr>
@@ -4660,7 +4690,7 @@
           <w:szCs w:val="19"/>
           <w:rtl w:val="0"/>
         </w:rPr>
-        <w:t xml:space="preserve">🎣 Bycatch: unintended non-target animals | injury + death</w:t>
+        <w:t xml:space="preserve">🚚 Animal transport: heat stress | thirst | fatigue</w:t>
       </w:r>
       <w:r>
         <w:rPr>
@@ -4680,7 +4710,7 @@
           <w:szCs w:val="16"/>
           <w:rtl w:val="0"/>
         </w:rPr>
-        <w:t xml:space="preserve">Source: NOAA Fisheries</w:t>
+        <w:t xml:space="preserve">Source: European Food Safety Authority</w:t>
       </w:r>
       <w:r>
         <w:rPr>
@@ -4703,6 +4733,231 @@
         <w:t xml:space="preserve">URL: </w:t>
       </w:r>
       <w:hyperlink r:id="rId69">
+        <w:r>
+          <w:rPr>
+            <w:color w:val="0563c1"/>
+            <w:u w:val="single"/>
+            <w:rtl w:val="0"/>
+          </w:rPr>
+          <w:t xml:space="preserve">https://www.efsa.europa.eu/en/topics/topic/animal-welfare</w:t>
+        </w:r>
+      </w:hyperlink>
+      <w:r>
+        <w:rPr>
+          <w:rtl w:val="0"/>
+        </w:rPr>
+      </w:r>
+    </w:p>
+    <w:p>
+      <w:pPr>
+        <w:spacing w:after="20" w:before="100" w:lineRule="auto"/>
+        <w:rPr/>
+      </w:pPr>
+      <w:r>
+        <w:rPr>
+          <w:b w:val="1"/>
+          <w:bCs w:val="1"/>
+          <w:sz w:val="19"/>
+          <w:szCs w:val="19"/>
+          <w:rtl w:val="0"/>
+        </w:rPr>
+        <w:t xml:space="preserve">🐔 Some farming systems: restrict highly motivated natural behaviors</w:t>
+      </w:r>
+      <w:r>
+        <w:rPr>
+          <w:rtl w:val="0"/>
+        </w:rPr>
+      </w:r>
+    </w:p>
+    <w:p>
+      <w:pPr>
+        <w:spacing w:after="0" w:lineRule="auto"/>
+        <w:ind w:left="173" w:firstLine="0"/>
+        <w:rPr/>
+      </w:pPr>
+      <w:r>
+        <w:rPr>
+          <w:sz w:val="16"/>
+          <w:szCs w:val="16"/>
+          <w:rtl w:val="0"/>
+        </w:rPr>
+        <w:t xml:space="preserve">Source: European Food Safety Authority</w:t>
+      </w:r>
+      <w:r>
+        <w:rPr>
+          <w:rtl w:val="0"/>
+        </w:rPr>
+      </w:r>
+    </w:p>
+    <w:p>
+      <w:pPr>
+        <w:spacing w:after="20" w:lineRule="auto"/>
+        <w:ind w:left="173" w:firstLine="0"/>
+        <w:rPr/>
+      </w:pPr>
+      <w:r>
+        <w:rPr>
+          <w:sz w:val="16"/>
+          <w:szCs w:val="16"/>
+          <w:rtl w:val="0"/>
+        </w:rPr>
+        <w:t xml:space="preserve">URL: </w:t>
+      </w:r>
+      <w:hyperlink r:id="rId70">
+        <w:r>
+          <w:rPr>
+            <w:color w:val="0563c1"/>
+            <w:u w:val="single"/>
+            <w:rtl w:val="0"/>
+          </w:rPr>
+          <w:t xml:space="preserve">https://www.efsa.europa.eu/en/topics/topic/animal-welfare</w:t>
+        </w:r>
+      </w:hyperlink>
+      <w:r>
+        <w:rPr>
+          <w:rtl w:val="0"/>
+        </w:rPr>
+      </w:r>
+    </w:p>
+    <w:p>
+      <w:pPr>
+        <w:spacing w:after="20" w:before="100" w:lineRule="auto"/>
+        <w:rPr/>
+      </w:pPr>
+      <w:r>
+        <w:rPr>
+          <w:b w:val="1"/>
+          <w:bCs w:val="1"/>
+          <w:sz w:val="19"/>
+          <w:szCs w:val="19"/>
+          <w:rtl w:val="0"/>
+        </w:rPr>
+        <w:t xml:space="preserve">🐷 Commercial farming: can involve painful procedures</w:t>
+      </w:r>
+      <w:r>
+        <w:rPr>
+          <w:rtl w:val="0"/>
+        </w:rPr>
+      </w:r>
+    </w:p>
+    <w:p>
+      <w:pPr>
+        <w:spacing w:after="0" w:lineRule="auto"/>
+        <w:ind w:left="173" w:firstLine="0"/>
+        <w:rPr/>
+      </w:pPr>
+      <w:r>
+        <w:rPr>
+          <w:sz w:val="16"/>
+          <w:szCs w:val="16"/>
+          <w:rtl w:val="0"/>
+        </w:rPr>
+        <w:t xml:space="preserve">Source: European Food Safety Authority</w:t>
+      </w:r>
+      <w:r>
+        <w:rPr>
+          <w:rtl w:val="0"/>
+        </w:rPr>
+      </w:r>
+    </w:p>
+    <w:p>
+      <w:pPr>
+        <w:spacing w:after="20" w:lineRule="auto"/>
+        <w:ind w:left="173" w:firstLine="0"/>
+        <w:rPr/>
+      </w:pPr>
+      <w:r>
+        <w:rPr>
+          <w:sz w:val="16"/>
+          <w:szCs w:val="16"/>
+          <w:rtl w:val="0"/>
+        </w:rPr>
+        <w:t xml:space="preserve">URL: </w:t>
+      </w:r>
+      <w:hyperlink r:id="rId71">
+        <w:r>
+          <w:rPr>
+            <w:color w:val="0563c1"/>
+            <w:u w:val="single"/>
+            <w:rtl w:val="0"/>
+          </w:rPr>
+          <w:t xml:space="preserve">https://www.efsa.europa.eu/en/topics/topic/animal-welfare</w:t>
+        </w:r>
+      </w:hyperlink>
+      <w:r>
+        <w:rPr>
+          <w:rtl w:val="0"/>
+        </w:rPr>
+      </w:r>
+    </w:p>
+    <w:p>
+      <w:pPr>
+        <w:pStyle w:val="Heading1"/>
+        <w:rPr/>
+      </w:pPr>
+      <w:r>
+        <w:rPr>
+          <w:rtl w:val="0"/>
+        </w:rPr>
+        <w:t xml:space="preserve">8. FISHING &amp; AQUACULTURE</w:t>
+      </w:r>
+    </w:p>
+    <w:p>
+      <w:pPr>
+        <w:spacing w:after="20" w:before="100" w:lineRule="auto"/>
+        <w:rPr/>
+      </w:pPr>
+      <w:r>
+        <w:rPr>
+          <w:b w:val="1"/>
+          <w:bCs w:val="1"/>
+          <w:sz w:val="19"/>
+          <w:szCs w:val="19"/>
+          <w:rtl w:val="0"/>
+        </w:rPr>
+        <w:t xml:space="preserve">🎣 Bycatch: unintended non-target animals | injury + death</w:t>
+      </w:r>
+      <w:r>
+        <w:rPr>
+          <w:rtl w:val="0"/>
+        </w:rPr>
+      </w:r>
+    </w:p>
+    <w:p>
+      <w:pPr>
+        <w:spacing w:after="0" w:lineRule="auto"/>
+        <w:ind w:left="173" w:firstLine="0"/>
+        <w:rPr/>
+      </w:pPr>
+      <w:r>
+        <w:rPr>
+          <w:sz w:val="16"/>
+          <w:szCs w:val="16"/>
+          <w:rtl w:val="0"/>
+        </w:rPr>
+        <w:t xml:space="preserve">Source: NOAA Fisheries</w:t>
+      </w:r>
+      <w:r>
+        <w:rPr>
+          <w:rtl w:val="0"/>
+        </w:rPr>
+      </w:r>
+    </w:p>
+    <w:p>
+      <w:pPr>
+        <w:spacing w:after="20" w:lineRule="auto"/>
+        <w:ind w:left="173" w:firstLine="0"/>
+        <w:rPr/>
+      </w:pPr>
+      <w:r>
+        <w:rPr>
+          <w:sz w:val="16"/>
+          <w:szCs w:val="16"/>
+          <w:rtl w:val="0"/>
+        </w:rPr>
+        <w:t xml:space="preserve">URL: </w:t>
+      </w:r>
+      <w:hyperlink r:id="rId72">
         <w:r>
           <w:rPr>
             <w:color w:val="0563c1"/>
@@ -4773,7 +5028,7 @@
         </w:rPr>
         <w:t xml:space="preserve">URL: </w:t>
       </w:r>
-      <w:hyperlink r:id="rId70">
+      <w:hyperlink r:id="rId73">
         <w:r>
           <w:rPr>
             <w:color w:val="0563c1"/>
@@ -4844,7 +5099,7 @@
         </w:rPr>
         <w:t xml:space="preserve">URL: </w:t>
       </w:r>
-      <w:hyperlink r:id="rId71">
+      <w:hyperlink r:id="rId74">
         <w:r>
           <w:rPr>
             <w:color w:val="0563c1"/>
@@ -4915,7 +5170,7 @@
         </w:rPr>
         <w:t xml:space="preserve">URL: </w:t>
       </w:r>
-      <w:hyperlink r:id="rId72">
+      <w:hyperlink r:id="rId75">
         <w:r>
           <w:rPr>
             <w:color w:val="0563c1"/>
@@ -4998,7 +5253,7 @@
         </w:rPr>
         <w:t xml:space="preserve">URL: </w:t>
       </w:r>
-      <w:hyperlink r:id="rId73">
+      <w:hyperlink r:id="rId76">
         <w:r>
           <w:rPr>
             <w:color w:val="0563c1"/>
@@ -5069,7 +5324,7 @@
         </w:rPr>
         <w:t xml:space="preserve">URL: </w:t>
       </w:r>
-      <w:hyperlink r:id="rId74">
+      <w:hyperlink r:id="rId77">
         <w:r>
           <w:rPr>
             <w:color w:val="0563c1"/>
@@ -5140,7 +5395,7 @@
         </w:rPr>
         <w:t xml:space="preserve">URL: </w:t>
       </w:r>
-      <w:hyperlink r:id="rId75">
+      <w:hyperlink r:id="rId78">
         <w:r>
           <w:rPr>
             <w:color w:val="0563c1"/>
@@ -5211,7 +5466,7 @@
         </w:rPr>
         <w:t xml:space="preserve">URL: </w:t>
       </w:r>
-      <w:hyperlink r:id="rId76">
+      <w:hyperlink r:id="rId79">
         <w:r>
           <w:rPr>
             <w:color w:val="0563c1"/>
@@ -14247,7 +14502,7 @@
       </w:r>
     </w:p>
     <w:sectPr>
-      <w:footerReference r:id="rId77" w:type="default"/>
+      <w:footerReference r:id="rId80" w:type="default"/>
       <w:pgSz w:h="15840" w:w="12240" w:orient="portrait"/>
       <w:pgMar w:bottom="936" w:top="936" w:left="1037" w:right="1037" w:header="720" w:footer="720"/>
       <w:pgNumType w:start="1"/>

</xml_diff>

<commit_message>
expand animal welfare section with documented practices, ages, and sources
</commit_message>
<xml_diff>
--- a/docs/scientific-evidence-library.docx
+++ b/docs/scientific-evidence-library.docx
@@ -4892,14 +4892,14 @@
     </w:p>
     <w:p>
       <w:pPr>
-        <w:pStyle w:val="Heading1"/>
-        <w:rPr/>
-      </w:pPr>
-      <w:r>
-        <w:rPr>
-          <w:rtl w:val="0"/>
-        </w:rPr>
-        <w:t xml:space="preserve">8. FISHING &amp; AQUACULTURE</w:t>
+        <w:pStyle w:val="Heading2"/>
+        <w:rPr/>
+      </w:pPr>
+      <w:r>
+        <w:rPr>
+          <w:rtl w:val="0"/>
+        </w:rPr>
+        <w:t xml:space="preserve">Documented Farming &amp; Slaughter Practices</w:t>
       </w:r>
     </w:p>
     <w:p>
@@ -4907,6 +4907,14 @@
         <w:spacing w:after="20" w:before="100" w:lineRule="auto"/>
         <w:rPr/>
       </w:pPr>
+      <w:r>
+        <w:rPr>
+          <w:b w:val="1"/>
+          <w:bCs w:val="1"/>
+          <w:rtl w:val="0"/>
+        </w:rPr>
+        <w:t xml:space="preserve">🐖  </w:t>
+      </w:r>
       <w:r>
         <w:rPr>
           <w:b w:val="1"/>
@@ -4915,6 +4923,868 @@
           <w:szCs w:val="19"/>
           <w:rtl w:val="0"/>
         </w:rPr>
+        <w:t xml:space="preserve">Pigs: Piglets only 2–5 days old can have their needle teeth clipped, tails cut, and testicles surgically removed. USDA research identifies castration, tail docking, teeth clipping, and ear notching/tagging as painful procedures that are usually performed without pain mitigation.</w:t>
+      </w:r>
+      <w:r>
+        <w:rPr>
+          <w:rtl w:val="0"/>
+        </w:rPr>
+      </w:r>
+    </w:p>
+    <w:p>
+      <w:pPr>
+        <w:spacing w:after="0" w:before="0" w:lineRule="auto"/>
+        <w:rPr/>
+      </w:pPr>
+      <w:r>
+        <w:rPr>
+          <w:b w:val="0"/>
+          <w:bCs w:val="0"/>
+          <w:sz w:val="16"/>
+          <w:szCs w:val="16"/>
+          <w:rtl w:val="0"/>
+        </w:rPr>
+        <w:t xml:space="preserve">Source: USDA APHIS Swine Industry Manual / USDA Agricultural Research Service — Anthony et al. (2014)</w:t>
+      </w:r>
+      <w:r>
+        <w:rPr>
+          <w:rtl w:val="0"/>
+        </w:rPr>
+      </w:r>
+    </w:p>
+    <w:p>
+      <w:pPr>
+        <w:spacing w:after="0" w:before="0" w:lineRule="auto"/>
+        <w:rPr/>
+      </w:pPr>
+      <w:r>
+        <w:rPr>
+          <w:b w:val="0"/>
+          <w:bCs w:val="0"/>
+          <w:sz w:val="16"/>
+          <w:szCs w:val="16"/>
+          <w:rtl w:val="0"/>
+        </w:rPr>
+        <w:t xml:space="preserve">URL: </w:t>
+      </w:r>
+      <w:hyperlink r:id="rId72">
+        <w:r>
+          <w:rPr>
+            <w:b w:val="0"/>
+            <w:bCs w:val="0"/>
+            <w:color w:val="1155cc"/>
+            <w:sz w:val="16"/>
+            <w:szCs w:val="16"/>
+            <w:u w:val="single"/>
+            <w:rtl w:val="0"/>
+          </w:rPr>
+          <w:t xml:space="preserve">https://www.aphis.usda.gov/sites/default/files/swine_industry_manual.pdf</w:t>
+        </w:r>
+      </w:hyperlink>
+      <w:r>
+        <w:rPr>
+          <w:b w:val="0"/>
+          <w:bCs w:val="0"/>
+          <w:sz w:val="16"/>
+          <w:szCs w:val="16"/>
+          <w:rtl w:val="0"/>
+        </w:rPr>
+        <w:t xml:space="preserve"> </w:t>
+      </w:r>
+      <w:r>
+        <w:rPr>
+          <w:rtl w:val="0"/>
+        </w:rPr>
+      </w:r>
+    </w:p>
+    <w:p>
+      <w:pPr>
+        <w:spacing w:after="20" w:before="0" w:lineRule="auto"/>
+        <w:rPr/>
+      </w:pPr>
+      <w:r>
+        <w:rPr>
+          <w:b w:val="0"/>
+          <w:bCs w:val="0"/>
+          <w:sz w:val="16"/>
+          <w:szCs w:val="16"/>
+          <w:rtl w:val="0"/>
+        </w:rPr>
+        <w:t xml:space="preserve">URL: </w:t>
+      </w:r>
+      <w:hyperlink r:id="rId73">
+        <w:r>
+          <w:rPr>
+            <w:b w:val="0"/>
+            <w:bCs w:val="0"/>
+            <w:color w:val="1155cc"/>
+            <w:sz w:val="16"/>
+            <w:szCs w:val="16"/>
+            <w:u w:val="single"/>
+            <w:rtl w:val="0"/>
+          </w:rPr>
+          <w:t xml:space="preserve">https://www.ars.usda.gov/research/publications/publication/?seqNo115=304145</w:t>
+        </w:r>
+      </w:hyperlink>
+      <w:r>
+        <w:rPr>
+          <w:b w:val="0"/>
+          <w:bCs w:val="0"/>
+          <w:sz w:val="16"/>
+          <w:szCs w:val="16"/>
+          <w:rtl w:val="0"/>
+        </w:rPr>
+        <w:t xml:space="preserve"> </w:t>
+      </w:r>
+      <w:r>
+        <w:rPr>
+          <w:rtl w:val="0"/>
+        </w:rPr>
+      </w:r>
+    </w:p>
+    <w:p>
+      <w:pPr>
+        <w:spacing w:after="20" w:before="100" w:lineRule="auto"/>
+        <w:rPr/>
+      </w:pPr>
+      <w:r>
+        <w:rPr>
+          <w:b w:val="1"/>
+          <w:bCs w:val="1"/>
+          <w:sz w:val="19"/>
+          <w:szCs w:val="19"/>
+          <w:rtl w:val="0"/>
+        </w:rPr>
+        <w:t xml:space="preserve">Castration: Farm animals are castrated for production purposes by surgical removal of the testicles or by crushing or restricting their blood and nerve supply. USDA describes castration as painful and reports that it is commonly performed without anesthesia or postoperative pain relief.</w:t>
+      </w:r>
+      <w:r>
+        <w:rPr>
+          <w:rtl w:val="0"/>
+        </w:rPr>
+      </w:r>
+    </w:p>
+    <w:p>
+      <w:pPr>
+        <w:spacing w:after="0" w:before="0" w:lineRule="auto"/>
+        <w:rPr/>
+      </w:pPr>
+      <w:r>
+        <w:rPr>
+          <w:b w:val="0"/>
+          <w:bCs w:val="0"/>
+          <w:sz w:val="16"/>
+          <w:szCs w:val="16"/>
+          <w:rtl w:val="0"/>
+        </w:rPr>
+        <w:t xml:space="preserve">Source: USDA Agricultural Research Service, Farm Animal Welfare Fact Sheet</w:t>
+      </w:r>
+      <w:r>
+        <w:rPr>
+          <w:rtl w:val="0"/>
+        </w:rPr>
+      </w:r>
+    </w:p>
+    <w:p>
+      <w:pPr>
+        <w:spacing w:after="20" w:before="0" w:lineRule="auto"/>
+        <w:rPr/>
+      </w:pPr>
+      <w:r>
+        <w:rPr>
+          <w:b w:val="0"/>
+          <w:bCs w:val="0"/>
+          <w:sz w:val="16"/>
+          <w:szCs w:val="16"/>
+          <w:rtl w:val="0"/>
+        </w:rPr>
+        <w:t xml:space="preserve">URL: </w:t>
+      </w:r>
+      <w:hyperlink r:id="rId74">
+        <w:r>
+          <w:rPr>
+            <w:b w:val="0"/>
+            <w:bCs w:val="0"/>
+            <w:color w:val="1155cc"/>
+            <w:sz w:val="16"/>
+            <w:szCs w:val="16"/>
+            <w:u w:val="single"/>
+            <w:rtl w:val="0"/>
+          </w:rPr>
+          <w:t xml:space="preserve">https://www.ars.usda.gov/ARSUserFiles/50201500/Castration%20Fact%20Sheet.pdf</w:t>
+        </w:r>
+      </w:hyperlink>
+      <w:r>
+        <w:rPr>
+          <w:b w:val="0"/>
+          <w:bCs w:val="0"/>
+          <w:sz w:val="16"/>
+          <w:szCs w:val="16"/>
+          <w:rtl w:val="0"/>
+        </w:rPr>
+        <w:t xml:space="preserve"> </w:t>
+      </w:r>
+      <w:r>
+        <w:rPr>
+          <w:rtl w:val="0"/>
+        </w:rPr>
+      </w:r>
+    </w:p>
+    <w:p>
+      <w:pPr>
+        <w:spacing w:after="20" w:before="100" w:lineRule="auto"/>
+        <w:rPr/>
+      </w:pPr>
+      <w:r>
+        <w:rPr>
+          <w:b w:val="1"/>
+          <w:bCs w:val="1"/>
+          <w:sz w:val="19"/>
+          <w:szCs w:val="19"/>
+          <w:rtl w:val="0"/>
+        </w:rPr>
+        <w:t xml:space="preserve">Dehorning: Calves can have horn-producing tissue destroyed with a hot iron or caustic paste, or developed horns physically removed. USDA research documents pain and distress after dehorning; studies cited by USDA include calves from 4–8 weeks old through 6 months old.</w:t>
+      </w:r>
+      <w:r>
+        <w:rPr>
+          <w:rtl w:val="0"/>
+        </w:rPr>
+      </w:r>
+    </w:p>
+    <w:p>
+      <w:pPr>
+        <w:spacing w:after="0" w:before="0" w:lineRule="auto"/>
+        <w:rPr/>
+      </w:pPr>
+      <w:r>
+        <w:rPr>
+          <w:b w:val="0"/>
+          <w:bCs w:val="0"/>
+          <w:sz w:val="16"/>
+          <w:szCs w:val="16"/>
+          <w:rtl w:val="0"/>
+        </w:rPr>
+        <w:t xml:space="preserve">Source: USDA APHIS / USDA Agricultural Research Service</w:t>
+      </w:r>
+      <w:r>
+        <w:rPr>
+          <w:rtl w:val="0"/>
+        </w:rPr>
+      </w:r>
+    </w:p>
+    <w:p>
+      <w:pPr>
+        <w:spacing w:after="0" w:before="0" w:lineRule="auto"/>
+        <w:rPr/>
+      </w:pPr>
+      <w:r>
+        <w:rPr>
+          <w:b w:val="0"/>
+          <w:bCs w:val="0"/>
+          <w:sz w:val="16"/>
+          <w:szCs w:val="16"/>
+          <w:rtl w:val="0"/>
+        </w:rPr>
+        <w:t xml:space="preserve">URL: </w:t>
+      </w:r>
+      <w:hyperlink r:id="rId75">
+        <w:r>
+          <w:rPr>
+            <w:b w:val="0"/>
+            <w:bCs w:val="0"/>
+            <w:color w:val="1155cc"/>
+            <w:sz w:val="16"/>
+            <w:szCs w:val="16"/>
+            <w:u w:val="single"/>
+            <w:rtl w:val="0"/>
+          </w:rPr>
+          <w:t xml:space="preserve">https://www.aphis.usda.gov/sites/default/files/dairy07_ir_calfhealth.pdf</w:t>
+        </w:r>
+      </w:hyperlink>
+      <w:r>
+        <w:rPr>
+          <w:b w:val="0"/>
+          <w:bCs w:val="0"/>
+          <w:sz w:val="16"/>
+          <w:szCs w:val="16"/>
+          <w:rtl w:val="0"/>
+        </w:rPr>
+        <w:t xml:space="preserve"> </w:t>
+      </w:r>
+      <w:r>
+        <w:rPr>
+          <w:rtl w:val="0"/>
+        </w:rPr>
+      </w:r>
+    </w:p>
+    <w:p>
+      <w:pPr>
+        <w:spacing w:after="20" w:before="0" w:lineRule="auto"/>
+        <w:rPr/>
+      </w:pPr>
+      <w:r>
+        <w:rPr>
+          <w:b w:val="0"/>
+          <w:bCs w:val="0"/>
+          <w:sz w:val="16"/>
+          <w:szCs w:val="16"/>
+          <w:rtl w:val="0"/>
+        </w:rPr>
+        <w:t xml:space="preserve">URL: </w:t>
+      </w:r>
+      <w:hyperlink r:id="rId76">
+        <w:r>
+          <w:rPr>
+            <w:b w:val="0"/>
+            <w:bCs w:val="0"/>
+            <w:color w:val="1155cc"/>
+            <w:sz w:val="16"/>
+            <w:szCs w:val="16"/>
+            <w:u w:val="single"/>
+            <w:rtl w:val="0"/>
+          </w:rPr>
+          <w:t xml:space="preserve">https://www.ars.usda.gov/research/publications/publication/?seqNo115=134782</w:t>
+        </w:r>
+      </w:hyperlink>
+      <w:r>
+        <w:rPr>
+          <w:b w:val="0"/>
+          <w:bCs w:val="0"/>
+          <w:sz w:val="16"/>
+          <w:szCs w:val="16"/>
+          <w:rtl w:val="0"/>
+        </w:rPr>
+        <w:t xml:space="preserve"> </w:t>
+      </w:r>
+      <w:r>
+        <w:rPr>
+          <w:rtl w:val="0"/>
+        </w:rPr>
+      </w:r>
+    </w:p>
+    <w:p>
+      <w:pPr>
+        <w:spacing w:after="20" w:before="100" w:lineRule="auto"/>
+        <w:rPr/>
+      </w:pPr>
+      <w:r>
+        <w:rPr>
+          <w:b w:val="1"/>
+          <w:bCs w:val="1"/>
+          <w:rtl w:val="0"/>
+        </w:rPr>
+        <w:t xml:space="preserve">🐄  </w:t>
+      </w:r>
+      <w:r>
+        <w:rPr>
+          <w:b w:val="1"/>
+          <w:bCs w:val="1"/>
+          <w:sz w:val="19"/>
+          <w:szCs w:val="19"/>
+          <w:rtl w:val="0"/>
+        </w:rPr>
+        <w:t xml:space="preserve">Dairy: Cows are bred or artificially inseminated so they become pregnant and give birth to calves, sustaining commercial milk production. Dairy calves are commonly separated from their mothers soon after birth.</w:t>
+      </w:r>
+      <w:r>
+        <w:rPr>
+          <w:rtl w:val="0"/>
+        </w:rPr>
+      </w:r>
+    </w:p>
+    <w:p>
+      <w:pPr>
+        <w:spacing w:after="0" w:before="0" w:lineRule="auto"/>
+        <w:rPr/>
+      </w:pPr>
+      <w:r>
+        <w:rPr>
+          <w:b w:val="0"/>
+          <w:bCs w:val="0"/>
+          <w:sz w:val="16"/>
+          <w:szCs w:val="16"/>
+          <w:rtl w:val="0"/>
+        </w:rPr>
+        <w:t xml:space="preserve">Source: USDA NIFA / USDA Agricultural Research Service / USDA National Agricultural Library</w:t>
+      </w:r>
+      <w:r>
+        <w:rPr>
+          <w:rtl w:val="0"/>
+        </w:rPr>
+      </w:r>
+    </w:p>
+    <w:p>
+      <w:pPr>
+        <w:spacing w:after="0" w:before="0" w:lineRule="auto"/>
+        <w:rPr/>
+      </w:pPr>
+      <w:r>
+        <w:rPr>
+          <w:b w:val="0"/>
+          <w:bCs w:val="0"/>
+          <w:sz w:val="16"/>
+          <w:szCs w:val="16"/>
+          <w:rtl w:val="0"/>
+        </w:rPr>
+        <w:t xml:space="preserve">URL: </w:t>
+      </w:r>
+      <w:hyperlink r:id="rId77">
+        <w:r>
+          <w:rPr>
+            <w:b w:val="0"/>
+            <w:bCs w:val="0"/>
+            <w:color w:val="1155cc"/>
+            <w:sz w:val="16"/>
+            <w:szCs w:val="16"/>
+            <w:u w:val="single"/>
+            <w:rtl w:val="0"/>
+          </w:rPr>
+          <w:t xml:space="preserve">https://www.nifa.usda.gov/grants/programs/animal-programs/research-assisted-reproductive-technologies</w:t>
+        </w:r>
+      </w:hyperlink>
+      <w:r>
+        <w:rPr>
+          <w:b w:val="0"/>
+          <w:bCs w:val="0"/>
+          <w:sz w:val="16"/>
+          <w:szCs w:val="16"/>
+          <w:rtl w:val="0"/>
+        </w:rPr>
+        <w:t xml:space="preserve"> </w:t>
+      </w:r>
+      <w:r>
+        <w:rPr>
+          <w:rtl w:val="0"/>
+        </w:rPr>
+      </w:r>
+    </w:p>
+    <w:p>
+      <w:pPr>
+        <w:spacing w:after="0" w:before="0" w:lineRule="auto"/>
+        <w:rPr/>
+      </w:pPr>
+      <w:r>
+        <w:rPr>
+          <w:b w:val="0"/>
+          <w:bCs w:val="0"/>
+          <w:sz w:val="16"/>
+          <w:szCs w:val="16"/>
+          <w:rtl w:val="0"/>
+        </w:rPr>
+        <w:t xml:space="preserve">URL: </w:t>
+      </w:r>
+      <w:hyperlink r:id="rId78">
+        <w:r>
+          <w:rPr>
+            <w:b w:val="0"/>
+            <w:bCs w:val="0"/>
+            <w:color w:val="1155cc"/>
+            <w:sz w:val="16"/>
+            <w:szCs w:val="16"/>
+            <w:u w:val="single"/>
+            <w:rtl w:val="0"/>
+          </w:rPr>
+          <w:t xml:space="preserve">https://www.ars.usda.gov/research/publications/publication/?seqNo115=281349</w:t>
+        </w:r>
+      </w:hyperlink>
+      <w:r>
+        <w:rPr>
+          <w:b w:val="0"/>
+          <w:bCs w:val="0"/>
+          <w:sz w:val="16"/>
+          <w:szCs w:val="16"/>
+          <w:rtl w:val="0"/>
+        </w:rPr>
+        <w:t xml:space="preserve"> </w:t>
+      </w:r>
+      <w:r>
+        <w:rPr>
+          <w:rtl w:val="0"/>
+        </w:rPr>
+      </w:r>
+    </w:p>
+    <w:p>
+      <w:pPr>
+        <w:spacing w:after="20" w:before="0" w:lineRule="auto"/>
+        <w:rPr/>
+      </w:pPr>
+      <w:r>
+        <w:rPr>
+          <w:b w:val="0"/>
+          <w:bCs w:val="0"/>
+          <w:sz w:val="16"/>
+          <w:szCs w:val="16"/>
+          <w:rtl w:val="0"/>
+        </w:rPr>
+        <w:t xml:space="preserve">URL: </w:t>
+      </w:r>
+      <w:hyperlink r:id="rId79">
+        <w:r>
+          <w:rPr>
+            <w:b w:val="0"/>
+            <w:bCs w:val="0"/>
+            <w:color w:val="1155cc"/>
+            <w:sz w:val="16"/>
+            <w:szCs w:val="16"/>
+            <w:u w:val="single"/>
+            <w:rtl w:val="0"/>
+          </w:rPr>
+          <w:t xml:space="preserve">https://www.nal.usda.gov/research-tools/food-safety-research-projects/investigating-impact-cow-calf-contact-dairy-cow-and-calf-welfare</w:t>
+        </w:r>
+      </w:hyperlink>
+      <w:r>
+        <w:rPr>
+          <w:b w:val="0"/>
+          <w:bCs w:val="0"/>
+          <w:sz w:val="16"/>
+          <w:szCs w:val="16"/>
+          <w:rtl w:val="0"/>
+        </w:rPr>
+        <w:t xml:space="preserve"> </w:t>
+      </w:r>
+      <w:r>
+        <w:rPr>
+          <w:rtl w:val="0"/>
+        </w:rPr>
+      </w:r>
+    </w:p>
+    <w:p>
+      <w:pPr>
+        <w:spacing w:after="20" w:before="100" w:lineRule="auto"/>
+        <w:rPr/>
+      </w:pPr>
+      <w:r>
+        <w:rPr>
+          <w:b w:val="1"/>
+          <w:bCs w:val="1"/>
+          <w:rtl w:val="0"/>
+        </w:rPr>
+        <w:t xml:space="preserve">🐔 </w:t>
+      </w:r>
+      <w:r>
+        <w:rPr>
+          <w:b w:val="1"/>
+          <w:bCs w:val="1"/>
+          <w:sz w:val="19"/>
+          <w:szCs w:val="19"/>
+          <w:rtl w:val="0"/>
+        </w:rPr>
+        <w:t xml:space="preserve">Chickens: USDA poultry guidance describes live birds being hung upside down by their legs in metal shackles, electrically stunned, then having major neck vessels cut so they bleed to death. USDA slaughter research has used commercial broilers only 36–51 days old.</w:t>
+      </w:r>
+      <w:r>
+        <w:rPr>
+          <w:rtl w:val="0"/>
+        </w:rPr>
+      </w:r>
+    </w:p>
+    <w:p>
+      <w:pPr>
+        <w:spacing w:after="0" w:before="0" w:lineRule="auto"/>
+        <w:rPr/>
+      </w:pPr>
+      <w:r>
+        <w:rPr>
+          <w:b w:val="0"/>
+          <w:bCs w:val="0"/>
+          <w:sz w:val="16"/>
+          <w:szCs w:val="16"/>
+          <w:rtl w:val="0"/>
+        </w:rPr>
+        <w:t xml:space="preserve">Source: USDA Agricultural Marketing Service / USDA Agricultural Research Service</w:t>
+      </w:r>
+      <w:r>
+        <w:rPr>
+          <w:rtl w:val="0"/>
+        </w:rPr>
+      </w:r>
+    </w:p>
+    <w:p>
+      <w:pPr>
+        <w:spacing w:after="0" w:before="0" w:lineRule="auto"/>
+        <w:rPr/>
+      </w:pPr>
+      <w:r>
+        <w:rPr>
+          <w:b w:val="0"/>
+          <w:bCs w:val="0"/>
+          <w:sz w:val="16"/>
+          <w:szCs w:val="16"/>
+          <w:rtl w:val="0"/>
+        </w:rPr>
+        <w:t xml:space="preserve">URL: </w:t>
+      </w:r>
+      <w:hyperlink r:id="rId80">
+        <w:r>
+          <w:rPr>
+            <w:b w:val="0"/>
+            <w:bCs w:val="0"/>
+            <w:color w:val="1155cc"/>
+            <w:sz w:val="16"/>
+            <w:szCs w:val="16"/>
+            <w:u w:val="single"/>
+            <w:rtl w:val="0"/>
+          </w:rPr>
+          <w:t xml:space="preserve">https://www.ams.usda.gov/sites/default/files/media/packetga.pdf</w:t>
+        </w:r>
+      </w:hyperlink>
+      <w:r>
+        <w:rPr>
+          <w:b w:val="0"/>
+          <w:bCs w:val="0"/>
+          <w:sz w:val="16"/>
+          <w:szCs w:val="16"/>
+          <w:rtl w:val="0"/>
+        </w:rPr>
+        <w:t xml:space="preserve"> </w:t>
+      </w:r>
+      <w:r>
+        <w:rPr>
+          <w:rtl w:val="0"/>
+        </w:rPr>
+      </w:r>
+    </w:p>
+    <w:p>
+      <w:pPr>
+        <w:spacing w:after="20" w:before="0" w:lineRule="auto"/>
+        <w:rPr/>
+      </w:pPr>
+      <w:r>
+        <w:rPr>
+          <w:b w:val="0"/>
+          <w:bCs w:val="0"/>
+          <w:sz w:val="16"/>
+          <w:szCs w:val="16"/>
+          <w:rtl w:val="0"/>
+        </w:rPr>
+        <w:t xml:space="preserve">URL: </w:t>
+      </w:r>
+      <w:hyperlink r:id="rId81">
+        <w:r>
+          <w:rPr>
+            <w:b w:val="0"/>
+            <w:bCs w:val="0"/>
+            <w:color w:val="1155cc"/>
+            <w:sz w:val="16"/>
+            <w:szCs w:val="16"/>
+            <w:u w:val="single"/>
+            <w:rtl w:val="0"/>
+          </w:rPr>
+          <w:t xml:space="preserve">https://www.ars.usda.gov/research/publications/publication/?seqNo115=396299</w:t>
+        </w:r>
+      </w:hyperlink>
+      <w:r>
+        <w:rPr>
+          <w:b w:val="0"/>
+          <w:bCs w:val="0"/>
+          <w:sz w:val="16"/>
+          <w:szCs w:val="16"/>
+          <w:rtl w:val="0"/>
+        </w:rPr>
+        <w:t xml:space="preserve"> </w:t>
+      </w:r>
+      <w:r>
+        <w:rPr>
+          <w:rtl w:val="0"/>
+        </w:rPr>
+      </w:r>
+    </w:p>
+    <w:p>
+      <w:pPr>
+        <w:spacing w:after="20" w:before="100" w:lineRule="auto"/>
+        <w:rPr/>
+      </w:pPr>
+      <w:r>
+        <w:rPr>
+          <w:b w:val="1"/>
+          <w:bCs w:val="1"/>
+          <w:sz w:val="19"/>
+          <w:szCs w:val="19"/>
+          <w:rtl w:val="0"/>
+        </w:rPr>
+        <w:t xml:space="preserve">Failed stunning: Electrical stunning must render birds unconscious rather than merely paralyze them. USDA guidance states that birds should be dead before entering the scald tank, illustrating why failed stunning or cutting is a serious welfare hazard.</w:t>
+      </w:r>
+      <w:r>
+        <w:rPr>
+          <w:rtl w:val="0"/>
+        </w:rPr>
+      </w:r>
+    </w:p>
+    <w:p>
+      <w:pPr>
+        <w:spacing w:after="0" w:before="0" w:lineRule="auto"/>
+        <w:rPr/>
+      </w:pPr>
+      <w:r>
+        <w:rPr>
+          <w:b w:val="0"/>
+          <w:bCs w:val="0"/>
+          <w:sz w:val="16"/>
+          <w:szCs w:val="16"/>
+          <w:rtl w:val="0"/>
+        </w:rPr>
+        <w:t xml:space="preserve">Source: USDA Agricultural Marketing Service</w:t>
+      </w:r>
+      <w:r>
+        <w:rPr>
+          <w:rtl w:val="0"/>
+        </w:rPr>
+      </w:r>
+    </w:p>
+    <w:p>
+      <w:pPr>
+        <w:spacing w:after="20" w:before="0" w:lineRule="auto"/>
+        <w:rPr/>
+      </w:pPr>
+      <w:r>
+        <w:rPr>
+          <w:b w:val="0"/>
+          <w:bCs w:val="0"/>
+          <w:sz w:val="16"/>
+          <w:szCs w:val="16"/>
+          <w:rtl w:val="0"/>
+        </w:rPr>
+        <w:t xml:space="preserve">URL: </w:t>
+      </w:r>
+      <w:hyperlink r:id="rId82">
+        <w:r>
+          <w:rPr>
+            <w:b w:val="0"/>
+            <w:bCs w:val="0"/>
+            <w:color w:val="1155cc"/>
+            <w:sz w:val="16"/>
+            <w:szCs w:val="16"/>
+            <w:u w:val="single"/>
+            <w:rtl w:val="0"/>
+          </w:rPr>
+          <w:t xml:space="preserve">https://www.ams.usda.gov/sites/default/files/media/packetga.pdf</w:t>
+        </w:r>
+      </w:hyperlink>
+      <w:r>
+        <w:rPr>
+          <w:b w:val="0"/>
+          <w:bCs w:val="0"/>
+          <w:sz w:val="16"/>
+          <w:szCs w:val="16"/>
+          <w:rtl w:val="0"/>
+        </w:rPr>
+        <w:t xml:space="preserve"> </w:t>
+      </w:r>
+      <w:r>
+        <w:rPr>
+          <w:rtl w:val="0"/>
+        </w:rPr>
+      </w:r>
+    </w:p>
+    <w:p>
+      <w:pPr>
+        <w:spacing w:after="20" w:before="100" w:lineRule="auto"/>
+        <w:rPr/>
+      </w:pPr>
+      <w:r>
+        <w:rPr>
+          <w:b w:val="1"/>
+          <w:bCs w:val="1"/>
+          <w:sz w:val="19"/>
+          <w:szCs w:val="19"/>
+          <w:rtl w:val="0"/>
+        </w:rPr>
+        <w:t xml:space="preserve">Slaughter: Federal humane-slaughter rules require covered livestock to be rendered insensible to pain before being shackled, hoisted, thrown, cast, or cut, subject to the law’s religious-slaughter provisions. Poultry are not covered by the federal Humane Methods of Slaughter Act.</w:t>
+      </w:r>
+      <w:r>
+        <w:rPr>
+          <w:rtl w:val="0"/>
+        </w:rPr>
+      </w:r>
+    </w:p>
+    <w:p>
+      <w:pPr>
+        <w:spacing w:after="0" w:before="0" w:lineRule="auto"/>
+        <w:rPr/>
+      </w:pPr>
+      <w:r>
+        <w:rPr>
+          <w:b w:val="0"/>
+          <w:bCs w:val="0"/>
+          <w:sz w:val="16"/>
+          <w:szCs w:val="16"/>
+          <w:rtl w:val="0"/>
+        </w:rPr>
+        <w:t xml:space="preserve">Source: USDA National Agricultural Library</w:t>
+      </w:r>
+      <w:r>
+        <w:rPr>
+          <w:rtl w:val="0"/>
+        </w:rPr>
+      </w:r>
+    </w:p>
+    <w:p>
+      <w:pPr>
+        <w:spacing w:after="20" w:before="0" w:lineRule="auto"/>
+        <w:rPr/>
+      </w:pPr>
+      <w:r>
+        <w:rPr>
+          <w:b w:val="0"/>
+          <w:bCs w:val="0"/>
+          <w:sz w:val="16"/>
+          <w:szCs w:val="16"/>
+          <w:rtl w:val="0"/>
+        </w:rPr>
+        <w:t xml:space="preserve">URL: </w:t>
+      </w:r>
+      <w:hyperlink r:id="rId83">
+        <w:r>
+          <w:rPr>
+            <w:b w:val="0"/>
+            <w:bCs w:val="0"/>
+            <w:color w:val="1155cc"/>
+            <w:sz w:val="16"/>
+            <w:szCs w:val="16"/>
+            <w:u w:val="single"/>
+            <w:rtl w:val="0"/>
+          </w:rPr>
+          <w:t xml:space="preserve">https://www.nal.usda.gov/animal-health-and-welfare/humane-methods-slaughter-act</w:t>
+        </w:r>
+      </w:hyperlink>
+      <w:r>
+        <w:rPr>
+          <w:b w:val="0"/>
+          <w:bCs w:val="0"/>
+          <w:sz w:val="16"/>
+          <w:szCs w:val="16"/>
+          <w:rtl w:val="0"/>
+        </w:rPr>
+        <w:t xml:space="preserve"> </w:t>
+      </w:r>
+      <w:r>
+        <w:rPr>
+          <w:rtl w:val="0"/>
+        </w:rPr>
+      </w:r>
+    </w:p>
+    <w:p>
+      <w:pPr>
+        <w:pStyle w:val="Heading1"/>
+        <w:rPr/>
+      </w:pPr>
+      <w:r>
+        <w:rPr>
+          <w:rtl w:val="0"/>
+        </w:rPr>
+        <w:t xml:space="preserve">8. FISHING &amp; AQUACULTURE</w:t>
+      </w:r>
+    </w:p>
+    <w:p>
+      <w:pPr>
+        <w:spacing w:after="20" w:before="100" w:lineRule="auto"/>
+        <w:rPr/>
+      </w:pPr>
+      <w:r>
+        <w:rPr>
+          <w:b w:val="1"/>
+          <w:bCs w:val="1"/>
+          <w:sz w:val="19"/>
+          <w:szCs w:val="19"/>
+          <w:rtl w:val="0"/>
+        </w:rPr>
         <w:t xml:space="preserve">🎣 Bycatch: unintended non-target animals | injury + death</w:t>
       </w:r>
       <w:r>
@@ -4957,7 +5827,7 @@
         </w:rPr>
         <w:t xml:space="preserve">URL: </w:t>
       </w:r>
-      <w:hyperlink r:id="rId72">
+      <w:hyperlink r:id="rId84">
         <w:r>
           <w:rPr>
             <w:color w:val="0563c1"/>
@@ -5028,7 +5898,7 @@
         </w:rPr>
         <w:t xml:space="preserve">URL: </w:t>
       </w:r>
-      <w:hyperlink r:id="rId73">
+      <w:hyperlink r:id="rId85">
         <w:r>
           <w:rPr>
             <w:color w:val="0563c1"/>
@@ -5099,7 +5969,7 @@
         </w:rPr>
         <w:t xml:space="preserve">URL: </w:t>
       </w:r>
-      <w:hyperlink r:id="rId74">
+      <w:hyperlink r:id="rId86">
         <w:r>
           <w:rPr>
             <w:color w:val="0563c1"/>
@@ -5170,7 +6040,7 @@
         </w:rPr>
         <w:t xml:space="preserve">URL: </w:t>
       </w:r>
-      <w:hyperlink r:id="rId75">
+      <w:hyperlink r:id="rId87">
         <w:r>
           <w:rPr>
             <w:color w:val="0563c1"/>
@@ -5253,7 +6123,7 @@
         </w:rPr>
         <w:t xml:space="preserve">URL: </w:t>
       </w:r>
-      <w:hyperlink r:id="rId76">
+      <w:hyperlink r:id="rId88">
         <w:r>
           <w:rPr>
             <w:color w:val="0563c1"/>
@@ -5324,7 +6194,7 @@
         </w:rPr>
         <w:t xml:space="preserve">URL: </w:t>
       </w:r>
-      <w:hyperlink r:id="rId77">
+      <w:hyperlink r:id="rId89">
         <w:r>
           <w:rPr>
             <w:color w:val="0563c1"/>
@@ -5395,7 +6265,7 @@
         </w:rPr>
         <w:t xml:space="preserve">URL: </w:t>
       </w:r>
-      <w:hyperlink r:id="rId78">
+      <w:hyperlink r:id="rId90">
         <w:r>
           <w:rPr>
             <w:color w:val="0563c1"/>
@@ -5466,7 +6336,7 @@
         </w:rPr>
         <w:t xml:space="preserve">URL: </w:t>
       </w:r>
-      <w:hyperlink r:id="rId79">
+      <w:hyperlink r:id="rId91">
         <w:r>
           <w:rPr>
             <w:color w:val="0563c1"/>
@@ -14527,7 +15397,7 @@
       </w:r>
     </w:p>
     <w:sectPr>
-      <w:footerReference r:id="rId80" w:type="default"/>
+      <w:footerReference r:id="rId92" w:type="default"/>
       <w:pgSz w:h="15840" w:w="12240" w:orient="portrait"/>
       <w:pgMar w:bottom="936" w:top="936" w:left="1037" w:right="1037" w:header="720" w:footer="720"/>
       <w:pgNumType w:start="1"/>

</xml_diff>

<commit_message>
Updated resource data and consistent formatting
</commit_message>
<xml_diff>
--- a/docs/scientific-evidence-library.docx
+++ b/docs/scientific-evidence-library.docx
@@ -166,6 +166,8 @@
         <w:r>
           <w:rPr>
             <w:color w:val="0563c1"/>
+            <w:sz w:val="16"/>
+            <w:szCs w:val="16"/>
             <w:u w:val="single"/>
             <w:rtl w:val="0"/>
           </w:rPr>
@@ -237,6 +239,8 @@
         <w:r>
           <w:rPr>
             <w:color w:val="0563c1"/>
+            <w:sz w:val="16"/>
+            <w:szCs w:val="16"/>
             <w:u w:val="single"/>
             <w:rtl w:val="0"/>
           </w:rPr>
@@ -308,6 +312,8 @@
         <w:r>
           <w:rPr>
             <w:color w:val="0563c1"/>
+            <w:sz w:val="16"/>
+            <w:szCs w:val="16"/>
             <w:u w:val="single"/>
             <w:rtl w:val="0"/>
           </w:rPr>
@@ -383,7 +389,7 @@
     </w:p>
     <w:p>
       <w:pPr>
-        <w:spacing w:after="20" w:lineRule="auto"/>
+        <w:spacing w:after="0" w:lineRule="auto"/>
         <w:ind w:left="173" w:firstLine="0"/>
         <w:rPr/>
       </w:pPr>
@@ -399,6 +405,8 @@
         <w:r>
           <w:rPr>
             <w:color w:val="0563c1"/>
+            <w:sz w:val="16"/>
+            <w:szCs w:val="16"/>
             <w:u w:val="single"/>
             <w:rtl w:val="0"/>
           </w:rPr>
@@ -429,6 +437,8 @@
         <w:r>
           <w:rPr>
             <w:color w:val="0563c1"/>
+            <w:sz w:val="16"/>
+            <w:szCs w:val="16"/>
             <w:u w:val="single"/>
             <w:rtl w:val="0"/>
           </w:rPr>
@@ -500,6 +510,8 @@
         <w:r>
           <w:rPr>
             <w:color w:val="0563c1"/>
+            <w:sz w:val="16"/>
+            <w:szCs w:val="16"/>
             <w:u w:val="single"/>
             <w:rtl w:val="0"/>
           </w:rPr>
@@ -571,6 +583,8 @@
         <w:r>
           <w:rPr>
             <w:color w:val="0563c1"/>
+            <w:sz w:val="16"/>
+            <w:szCs w:val="16"/>
             <w:u w:val="single"/>
             <w:rtl w:val="0"/>
           </w:rPr>
@@ -642,6 +656,8 @@
         <w:r>
           <w:rPr>
             <w:color w:val="0563c1"/>
+            <w:sz w:val="16"/>
+            <w:szCs w:val="16"/>
             <w:u w:val="single"/>
             <w:rtl w:val="0"/>
           </w:rPr>
@@ -713,6 +729,8 @@
         <w:r>
           <w:rPr>
             <w:color w:val="0563c1"/>
+            <w:sz w:val="16"/>
+            <w:szCs w:val="16"/>
             <w:u w:val="single"/>
             <w:rtl w:val="0"/>
           </w:rPr>
@@ -784,6 +802,8 @@
         <w:r>
           <w:rPr>
             <w:color w:val="0563c1"/>
+            <w:sz w:val="16"/>
+            <w:szCs w:val="16"/>
             <w:u w:val="single"/>
             <w:rtl w:val="0"/>
           </w:rPr>
@@ -855,6 +875,8 @@
         <w:r>
           <w:rPr>
             <w:color w:val="0563c1"/>
+            <w:sz w:val="16"/>
+            <w:szCs w:val="16"/>
             <w:u w:val="single"/>
             <w:rtl w:val="0"/>
           </w:rPr>
@@ -938,6 +960,8 @@
         <w:r>
           <w:rPr>
             <w:color w:val="0563c1"/>
+            <w:sz w:val="16"/>
+            <w:szCs w:val="16"/>
             <w:u w:val="single"/>
             <w:rtl w:val="0"/>
           </w:rPr>
@@ -1009,6 +1033,8 @@
         <w:r>
           <w:rPr>
             <w:color w:val="0563c1"/>
+            <w:sz w:val="16"/>
+            <w:szCs w:val="16"/>
             <w:u w:val="single"/>
             <w:rtl w:val="0"/>
           </w:rPr>
@@ -1080,6 +1106,8 @@
         <w:r>
           <w:rPr>
             <w:color w:val="0563c1"/>
+            <w:sz w:val="16"/>
+            <w:szCs w:val="16"/>
             <w:u w:val="single"/>
             <w:rtl w:val="0"/>
           </w:rPr>
@@ -1151,6 +1179,8 @@
         <w:r>
           <w:rPr>
             <w:color w:val="0563c1"/>
+            <w:sz w:val="16"/>
+            <w:szCs w:val="16"/>
             <w:u w:val="single"/>
             <w:rtl w:val="0"/>
           </w:rPr>
@@ -1222,6 +1252,8 @@
         <w:r>
           <w:rPr>
             <w:color w:val="0563c1"/>
+            <w:sz w:val="16"/>
+            <w:szCs w:val="16"/>
             <w:u w:val="single"/>
             <w:rtl w:val="0"/>
           </w:rPr>
@@ -1293,6 +1325,8 @@
         <w:r>
           <w:rPr>
             <w:color w:val="0563c1"/>
+            <w:sz w:val="16"/>
+            <w:szCs w:val="16"/>
             <w:u w:val="single"/>
             <w:rtl w:val="0"/>
           </w:rPr>
@@ -1376,6 +1410,8 @@
         <w:r>
           <w:rPr>
             <w:color w:val="0563c1"/>
+            <w:sz w:val="16"/>
+            <w:szCs w:val="16"/>
             <w:u w:val="single"/>
             <w:rtl w:val="0"/>
           </w:rPr>
@@ -1447,6 +1483,8 @@
         <w:r>
           <w:rPr>
             <w:color w:val="0563c1"/>
+            <w:sz w:val="16"/>
+            <w:szCs w:val="16"/>
             <w:u w:val="single"/>
             <w:rtl w:val="0"/>
           </w:rPr>
@@ -1518,6 +1556,8 @@
         <w:r>
           <w:rPr>
             <w:color w:val="0563c1"/>
+            <w:sz w:val="16"/>
+            <w:szCs w:val="16"/>
             <w:u w:val="single"/>
             <w:rtl w:val="0"/>
           </w:rPr>
@@ -1589,6 +1629,8 @@
         <w:r>
           <w:rPr>
             <w:color w:val="0563c1"/>
+            <w:sz w:val="16"/>
+            <w:szCs w:val="16"/>
             <w:u w:val="single"/>
             <w:rtl w:val="0"/>
           </w:rPr>
@@ -1660,6 +1702,8 @@
         <w:r>
           <w:rPr>
             <w:color w:val="0563c1"/>
+            <w:sz w:val="16"/>
+            <w:szCs w:val="16"/>
             <w:u w:val="single"/>
             <w:rtl w:val="0"/>
           </w:rPr>
@@ -1731,6 +1775,8 @@
         <w:r>
           <w:rPr>
             <w:color w:val="0563c1"/>
+            <w:sz w:val="16"/>
+            <w:szCs w:val="16"/>
             <w:u w:val="single"/>
             <w:rtl w:val="0"/>
           </w:rPr>
@@ -1814,6 +1860,8 @@
         <w:r>
           <w:rPr>
             <w:color w:val="0563c1"/>
+            <w:sz w:val="16"/>
+            <w:szCs w:val="16"/>
             <w:u w:val="single"/>
             <w:rtl w:val="0"/>
           </w:rPr>
@@ -1885,6 +1933,8 @@
         <w:r>
           <w:rPr>
             <w:color w:val="0563c1"/>
+            <w:sz w:val="16"/>
+            <w:szCs w:val="16"/>
             <w:u w:val="single"/>
             <w:rtl w:val="0"/>
           </w:rPr>
@@ -1899,18 +1949,6 @@
     </w:p>
     <w:p>
       <w:pPr>
-        <w:pStyle w:val="Heading2"/>
-        <w:rPr/>
-      </w:pPr>
-      <w:r>
-        <w:rPr>
-          <w:rtl w:val="0"/>
-        </w:rPr>
-        <w:t xml:space="preserve">Protein</w:t>
-      </w:r>
-    </w:p>
-    <w:p>
-      <w:pPr>
         <w:spacing w:after="20" w:before="100" w:lineRule="auto"/>
         <w:rPr/>
       </w:pPr>
@@ -1922,12 +1960,7 @@
           <w:szCs w:val="19"/>
           <w:rtl w:val="0"/>
         </w:rPr>
-        <w:t xml:space="preserve">🌱 Plant foods: all essential amino acids | vegan diets can meet protein needs</w:t>
-      </w:r>
-      <w:r>
-        <w:rPr>
-          <w:rtl w:val="0"/>
-        </w:rPr>
+        <w:t xml:space="preserve">🌱 2016 Academy position: appropriately planned vegetarian, including vegan, diets were nutritionally adequate and appropriate for all stages of the life cycle, including pregnancy, lactation, infancy, childhood, adolescence, older adulthood, and athletes</w:t>
       </w:r>
     </w:p>
     <w:p>
@@ -1942,10 +1975,12 @@
           <w:szCs w:val="16"/>
           <w:rtl w:val="0"/>
         </w:rPr>
-        <w:t xml:space="preserve">Source: Mariotti &amp; Gardner, Nutrients (2019)</w:t>
-      </w:r>
-      <w:r>
-        <w:rPr>
+        <w:t xml:space="preserve">Source: Academy of Nutrition and Dietetics (2016)</w:t>
+      </w:r>
+      <w:r>
+        <w:rPr>
+          <w:sz w:val="16"/>
+          <w:szCs w:val="16"/>
           <w:rtl w:val="0"/>
         </w:rPr>
       </w:r>
@@ -1968,6 +2003,88 @@
         <w:r>
           <w:rPr>
             <w:color w:val="0563c1"/>
+            <w:sz w:val="16"/>
+            <w:szCs w:val="16"/>
+            <w:u w:val="single"/>
+            <w:rtl w:val="0"/>
+          </w:rPr>
+          <w:t>https://doi.org/10.1016/j.jand.2016.09.025</w:t>
+        </w:r>
+      </w:hyperlink>
+    </w:p>
+    <w:p>
+      <w:pPr>
+        <w:pStyle w:val="Heading2"/>
+        <w:rPr/>
+      </w:pPr>
+      <w:r>
+        <w:rPr>
+          <w:rtl w:val="0"/>
+        </w:rPr>
+        <w:t xml:space="preserve">Protein</w:t>
+      </w:r>
+    </w:p>
+    <w:p>
+      <w:pPr>
+        <w:spacing w:after="20" w:before="100" w:lineRule="auto"/>
+        <w:rPr/>
+      </w:pPr>
+      <w:r>
+        <w:rPr>
+          <w:b w:val="1"/>
+          <w:bCs w:val="1"/>
+          <w:sz w:val="19"/>
+          <w:szCs w:val="19"/>
+          <w:rtl w:val="0"/>
+        </w:rPr>
+        <w:t xml:space="preserve">🌱 Plant foods: all essential amino acids | vegan diets can meet protein needs</w:t>
+      </w:r>
+      <w:r>
+        <w:rPr>
+          <w:rtl w:val="0"/>
+        </w:rPr>
+      </w:r>
+    </w:p>
+    <w:p>
+      <w:pPr>
+        <w:spacing w:after="0" w:lineRule="auto"/>
+        <w:ind w:left="173" w:firstLine="0"/>
+        <w:rPr/>
+      </w:pPr>
+      <w:r>
+        <w:rPr>
+          <w:sz w:val="16"/>
+          <w:szCs w:val="16"/>
+          <w:rtl w:val="0"/>
+        </w:rPr>
+        <w:t xml:space="preserve">Source: Mariotti &amp; Gardner, Nutrients (2019)</w:t>
+      </w:r>
+      <w:r>
+        <w:rPr>
+          <w:rtl w:val="0"/>
+        </w:rPr>
+      </w:r>
+    </w:p>
+    <w:p>
+      <w:pPr>
+        <w:spacing w:after="20" w:lineRule="auto"/>
+        <w:ind w:left="173" w:firstLine="0"/>
+        <w:rPr/>
+      </w:pPr>
+      <w:r>
+        <w:rPr>
+          <w:sz w:val="16"/>
+          <w:szCs w:val="16"/>
+          <w:rtl w:val="0"/>
+        </w:rPr>
+        <w:t xml:space="preserve">URL: </w:t>
+      </w:r>
+      <w:hyperlink r:id="rId32">
+        <w:r>
+          <w:rPr>
+            <w:color w:val="0563c1"/>
+            <w:sz w:val="16"/>
+            <w:szCs w:val="16"/>
             <w:u w:val="single"/>
             <w:rtl w:val="0"/>
           </w:rPr>
@@ -2035,10 +2152,12 @@
         </w:rPr>
         <w:t xml:space="preserve">URL: </w:t>
       </w:r>
-      <w:hyperlink r:id="rId32">
+      <w:hyperlink r:id="rId33">
         <w:r>
           <w:rPr>
             <w:color w:val="0563c1"/>
+            <w:sz w:val="16"/>
+            <w:szCs w:val="16"/>
             <w:u w:val="single"/>
             <w:rtl w:val="0"/>
           </w:rPr>
@@ -2106,7 +2225,7 @@
     </w:p>
     <w:p>
       <w:pPr>
-        <w:spacing w:after="20" w:lineRule="auto"/>
+        <w:spacing w:after="0" w:lineRule="auto"/>
         <w:ind w:left="173" w:firstLine="0"/>
         <w:rPr/>
       </w:pPr>
@@ -2118,10 +2237,12 @@
         </w:rPr>
         <w:t xml:space="preserve">URL: </w:t>
       </w:r>
-      <w:hyperlink r:id="rId33">
+      <w:hyperlink r:id="rId34">
         <w:r>
           <w:rPr>
             <w:color w:val="0563c1"/>
+            <w:sz w:val="16"/>
+            <w:szCs w:val="16"/>
             <w:u w:val="single"/>
             <w:rtl w:val="0"/>
           </w:rPr>
@@ -2148,10 +2269,12 @@
         </w:rPr>
         <w:t xml:space="preserve">URL: </w:t>
       </w:r>
-      <w:hyperlink r:id="rId34">
+      <w:hyperlink r:id="rId35">
         <w:r>
           <w:rPr>
             <w:color w:val="0563c1"/>
+            <w:sz w:val="16"/>
+            <w:szCs w:val="16"/>
             <w:u w:val="single"/>
             <w:rtl w:val="0"/>
           </w:rPr>
@@ -2231,10 +2354,12 @@
         </w:rPr>
         <w:t xml:space="preserve">URL: </w:t>
       </w:r>
-      <w:hyperlink r:id="rId35">
+      <w:hyperlink r:id="rId36">
         <w:r>
           <w:rPr>
             <w:color w:val="0563c1"/>
+            <w:sz w:val="16"/>
+            <w:szCs w:val="16"/>
             <w:u w:val="single"/>
             <w:rtl w:val="0"/>
           </w:rPr>
@@ -2302,10 +2427,12 @@
         </w:rPr>
         <w:t xml:space="preserve">URL: </w:t>
       </w:r>
-      <w:hyperlink r:id="rId36">
+      <w:hyperlink r:id="rId37">
         <w:r>
           <w:rPr>
             <w:color w:val="0563c1"/>
+            <w:sz w:val="16"/>
+            <w:szCs w:val="16"/>
             <w:u w:val="single"/>
             <w:rtl w:val="0"/>
           </w:rPr>
@@ -2385,10 +2512,12 @@
         </w:rPr>
         <w:t xml:space="preserve">URL: </w:t>
       </w:r>
-      <w:hyperlink r:id="rId37">
+      <w:hyperlink r:id="rId38">
         <w:r>
           <w:rPr>
             <w:color w:val="0563c1"/>
+            <w:sz w:val="16"/>
+            <w:szCs w:val="16"/>
             <w:u w:val="single"/>
             <w:rtl w:val="0"/>
           </w:rPr>
@@ -2468,10 +2597,12 @@
         </w:rPr>
         <w:t xml:space="preserve">URL: </w:t>
       </w:r>
-      <w:hyperlink r:id="rId38">
+      <w:hyperlink r:id="rId39">
         <w:r>
           <w:rPr>
             <w:color w:val="0563c1"/>
+            <w:sz w:val="16"/>
+            <w:szCs w:val="16"/>
             <w:u w:val="single"/>
             <w:rtl w:val="0"/>
           </w:rPr>
@@ -2539,10 +2670,12 @@
         </w:rPr>
         <w:t xml:space="preserve">URL: </w:t>
       </w:r>
-      <w:hyperlink r:id="rId39">
+      <w:hyperlink r:id="rId40">
         <w:r>
           <w:rPr>
             <w:color w:val="0563c1"/>
+            <w:sz w:val="16"/>
+            <w:szCs w:val="16"/>
             <w:u w:val="single"/>
             <w:rtl w:val="0"/>
           </w:rPr>
@@ -2622,10 +2755,12 @@
         </w:rPr>
         <w:t xml:space="preserve">URL: </w:t>
       </w:r>
-      <w:hyperlink r:id="rId40">
+      <w:hyperlink r:id="rId41">
         <w:r>
           <w:rPr>
             <w:color w:val="0563c1"/>
+            <w:sz w:val="16"/>
+            <w:szCs w:val="16"/>
             <w:u w:val="single"/>
             <w:rtl w:val="0"/>
           </w:rPr>
@@ -2693,10 +2828,12 @@
         </w:rPr>
         <w:t xml:space="preserve">URL: </w:t>
       </w:r>
-      <w:hyperlink r:id="rId41">
+      <w:hyperlink r:id="rId42">
         <w:r>
           <w:rPr>
             <w:color w:val="0563c1"/>
+            <w:sz w:val="16"/>
+            <w:szCs w:val="16"/>
             <w:u w:val="single"/>
             <w:rtl w:val="0"/>
           </w:rPr>
@@ -2776,10 +2913,12 @@
         </w:rPr>
         <w:t xml:space="preserve">URL: </w:t>
       </w:r>
-      <w:hyperlink r:id="rId42">
+      <w:hyperlink r:id="rId43">
         <w:r>
           <w:rPr>
             <w:color w:val="0563c1"/>
+            <w:sz w:val="16"/>
+            <w:szCs w:val="16"/>
             <w:u w:val="single"/>
             <w:rtl w:val="0"/>
           </w:rPr>
@@ -2847,10 +2986,12 @@
         </w:rPr>
         <w:t xml:space="preserve">URL: </w:t>
       </w:r>
-      <w:hyperlink r:id="rId43">
+      <w:hyperlink r:id="rId44">
         <w:r>
           <w:rPr>
             <w:color w:val="0563c1"/>
+            <w:sz w:val="16"/>
+            <w:szCs w:val="16"/>
             <w:u w:val="single"/>
             <w:rtl w:val="0"/>
           </w:rPr>
@@ -2918,10 +3059,12 @@
         </w:rPr>
         <w:t xml:space="preserve">URL: </w:t>
       </w:r>
-      <w:hyperlink r:id="rId44">
+      <w:hyperlink r:id="rId45">
         <w:r>
           <w:rPr>
             <w:color w:val="0563c1"/>
+            <w:sz w:val="16"/>
+            <w:szCs w:val="16"/>
             <w:u w:val="single"/>
             <w:rtl w:val="0"/>
           </w:rPr>
@@ -2960,87 +3103,6 @@
           <w:rtl w:val="0"/>
         </w:rPr>
         <w:t xml:space="preserve">🥩 Red + processed meat: +70 g/day associated with ~15% higher IHD | ~31% pneumonia | ~19% diverticular disease | ~10% colon polyps | ~30% diabetes</w:t>
-      </w:r>
-      <w:r>
-        <w:rPr>
-          <w:rtl w:val="0"/>
-        </w:rPr>
-      </w:r>
-    </w:p>
-    <w:p>
-      <w:pPr>
-        <w:spacing w:after="0" w:lineRule="auto"/>
-        <w:ind w:left="173" w:firstLine="0"/>
-        <w:rPr/>
-      </w:pPr>
-      <w:r>
-        <w:rPr>
-          <w:sz w:val="16"/>
-          <w:szCs w:val="16"/>
-          <w:rtl w:val="0"/>
-        </w:rPr>
-        <w:t xml:space="preserve">Source: Papier et al., BMC Medicine (2021)</w:t>
-      </w:r>
-      <w:r>
-        <w:rPr>
-          <w:rtl w:val="0"/>
-        </w:rPr>
-      </w:r>
-    </w:p>
-    <w:p>
-      <w:pPr>
-        <w:spacing w:after="20" w:lineRule="auto"/>
-        <w:ind w:left="173" w:firstLine="0"/>
-        <w:rPr/>
-      </w:pPr>
-      <w:r>
-        <w:rPr>
-          <w:sz w:val="16"/>
-          <w:szCs w:val="16"/>
-          <w:rtl w:val="0"/>
-        </w:rPr>
-        <w:t xml:space="preserve">URL: </w:t>
-      </w:r>
-      <w:hyperlink r:id="rId45">
-        <w:r>
-          <w:rPr>
-            <w:color w:val="1155cc"/>
-            <w:sz w:val="16"/>
-            <w:szCs w:val="16"/>
-            <w:u w:val="single"/>
-            <w:rtl w:val="0"/>
-          </w:rPr>
-          <w:t xml:space="preserve">https://doi.org/10.1186/s12916-021-01922-9</w:t>
-        </w:r>
-      </w:hyperlink>
-      <w:r>
-        <w:rPr>
-          <w:sz w:val="16"/>
-          <w:szCs w:val="16"/>
-          <w:rtl w:val="0"/>
-        </w:rPr>
-        <w:t xml:space="preserve"> </w:t>
-      </w:r>
-      <w:r>
-        <w:rPr>
-          <w:rtl w:val="0"/>
-        </w:rPr>
-      </w:r>
-    </w:p>
-    <w:p>
-      <w:pPr>
-        <w:spacing w:after="20" w:before="100" w:lineRule="auto"/>
-        <w:rPr/>
-      </w:pPr>
-      <w:r>
-        <w:rPr>
-          <w:b w:val="1"/>
-          <w:bCs w:val="1"/>
-          <w:sz w:val="19"/>
-          <w:szCs w:val="19"/>
-          <w:rtl w:val="0"/>
-        </w:rPr>
-        <w:t xml:space="preserve">🐔 Poultry: +30 g/day associated with ~17% higher GERD | ~12% gastritis/duodenitis | ~10% diverticular disease | ~11% gallbladder disease | ~14% diabetes</w:t>
       </w:r>
       <w:r>
         <w:rPr>
@@ -3121,7 +3183,7 @@
           <w:szCs w:val="19"/>
           <w:rtl w:val="0"/>
         </w:rPr>
-        <w:t xml:space="preserve">🩸 Higher unprocessed red meat + poultry: associated with lower iron-deficiency anemia risk</w:t>
+        <w:t xml:space="preserve">🐔 Poultry: +30 g/day associated with ~17% higher GERD | ~12% gastritis/duodenitis | ~10% diverticular disease | ~11% gallbladder disease | ~14% diabetes</w:t>
       </w:r>
       <w:r>
         <w:rPr>
@@ -3191,18 +3253,6 @@
     </w:p>
     <w:p>
       <w:pPr>
-        <w:pStyle w:val="Heading2"/>
-        <w:rPr/>
-      </w:pPr>
-      <w:r>
-        <w:rPr>
-          <w:rtl w:val="0"/>
-        </w:rPr>
-        <w:t xml:space="preserve">Type 2 Diabetes</w:t>
-      </w:r>
-    </w:p>
-    <w:p>
-      <w:pPr>
         <w:spacing w:after="20" w:before="100" w:lineRule="auto"/>
         <w:rPr/>
       </w:pPr>
@@ -3214,7 +3264,7 @@
           <w:szCs w:val="19"/>
           <w:rtl w:val="0"/>
         </w:rPr>
-        <w:t xml:space="preserve">🥩 Higher red-meat intake: associated with higher Type 2 diabetes risk</w:t>
+        <w:t xml:space="preserve">🩸 Higher unprocessed red meat + poultry: associated with lower iron-deficiency anemia risk</w:t>
       </w:r>
       <w:r>
         <w:rPr>
@@ -3234,7 +3284,7 @@
           <w:szCs w:val="16"/>
           <w:rtl w:val="0"/>
         </w:rPr>
-        <w:t xml:space="preserve">Source: Gu et al., American Journal of Clinical Nutrition (2023)</w:t>
+        <w:t xml:space="preserve">Source: Papier et al., BMC Medicine (2021)</w:t>
       </w:r>
       <w:r>
         <w:rPr>
@@ -3259,7 +3309,102 @@
       <w:hyperlink r:id="rId48">
         <w:r>
           <w:rPr>
+            <w:color w:val="1155cc"/>
+            <w:sz w:val="16"/>
+            <w:szCs w:val="16"/>
+            <w:u w:val="single"/>
+            <w:rtl w:val="0"/>
+          </w:rPr>
+          <w:t xml:space="preserve">https://doi.org/10.1186/s12916-021-01922-9</w:t>
+        </w:r>
+      </w:hyperlink>
+      <w:r>
+        <w:rPr>
+          <w:sz w:val="16"/>
+          <w:szCs w:val="16"/>
+          <w:rtl w:val="0"/>
+        </w:rPr>
+        <w:t xml:space="preserve"> </w:t>
+      </w:r>
+      <w:r>
+        <w:rPr>
+          <w:rtl w:val="0"/>
+        </w:rPr>
+      </w:r>
+    </w:p>
+    <w:p>
+      <w:pPr>
+        <w:pStyle w:val="Heading2"/>
+        <w:rPr/>
+      </w:pPr>
+      <w:r>
+        <w:rPr>
+          <w:rtl w:val="0"/>
+        </w:rPr>
+        <w:t xml:space="preserve">Type 2 Diabetes</w:t>
+      </w:r>
+    </w:p>
+    <w:p>
+      <w:pPr>
+        <w:spacing w:after="20" w:before="100" w:lineRule="auto"/>
+        <w:rPr/>
+      </w:pPr>
+      <w:r>
+        <w:rPr>
+          <w:b w:val="1"/>
+          <w:bCs w:val="1"/>
+          <w:sz w:val="19"/>
+          <w:szCs w:val="19"/>
+          <w:rtl w:val="0"/>
+        </w:rPr>
+        <w:t xml:space="preserve">🥩 Higher red-meat intake: associated with higher Type 2 diabetes risk</w:t>
+      </w:r>
+      <w:r>
+        <w:rPr>
+          <w:rtl w:val="0"/>
+        </w:rPr>
+      </w:r>
+    </w:p>
+    <w:p>
+      <w:pPr>
+        <w:spacing w:after="0" w:lineRule="auto"/>
+        <w:ind w:left="173" w:firstLine="0"/>
+        <w:rPr/>
+      </w:pPr>
+      <w:r>
+        <w:rPr>
+          <w:sz w:val="16"/>
+          <w:szCs w:val="16"/>
+          <w:rtl w:val="0"/>
+        </w:rPr>
+        <w:t xml:space="preserve">Source: Gu et al., American Journal of Clinical Nutrition (2023)</w:t>
+      </w:r>
+      <w:r>
+        <w:rPr>
+          <w:rtl w:val="0"/>
+        </w:rPr>
+      </w:r>
+    </w:p>
+    <w:p>
+      <w:pPr>
+        <w:spacing w:after="20" w:lineRule="auto"/>
+        <w:ind w:left="173" w:firstLine="0"/>
+        <w:rPr/>
+      </w:pPr>
+      <w:r>
+        <w:rPr>
+          <w:sz w:val="16"/>
+          <w:szCs w:val="16"/>
+          <w:rtl w:val="0"/>
+        </w:rPr>
+        <w:t xml:space="preserve">URL: </w:t>
+      </w:r>
+      <w:hyperlink r:id="rId49">
+        <w:r>
+          <w:rPr>
             <w:color w:val="0563c1"/>
+            <w:sz w:val="16"/>
+            <w:szCs w:val="16"/>
             <w:u w:val="single"/>
             <w:rtl w:val="0"/>
           </w:rPr>
@@ -3339,10 +3484,12 @@
         </w:rPr>
         <w:t xml:space="preserve">URL: </w:t>
       </w:r>
-      <w:hyperlink r:id="rId49">
+      <w:hyperlink r:id="rId50">
         <w:r>
           <w:rPr>
             <w:color w:val="0563c1"/>
+            <w:sz w:val="16"/>
+            <w:szCs w:val="16"/>
             <w:u w:val="single"/>
             <w:rtl w:val="0"/>
           </w:rPr>
@@ -3422,10 +3569,12 @@
         </w:rPr>
         <w:t xml:space="preserve">URL: </w:t>
       </w:r>
-      <w:hyperlink r:id="rId50">
+      <w:hyperlink r:id="rId51">
         <w:r>
           <w:rPr>
             <w:color w:val="0563c1"/>
+            <w:sz w:val="16"/>
+            <w:szCs w:val="16"/>
             <w:u w:val="single"/>
             <w:rtl w:val="0"/>
           </w:rPr>
@@ -3493,10 +3642,12 @@
         </w:rPr>
         <w:t xml:space="preserve">URL: </w:t>
       </w:r>
-      <w:hyperlink r:id="rId51">
+      <w:hyperlink r:id="rId52">
         <w:r>
           <w:rPr>
             <w:color w:val="0563c1"/>
+            <w:sz w:val="16"/>
+            <w:szCs w:val="16"/>
             <w:u w:val="single"/>
             <w:rtl w:val="0"/>
           </w:rPr>
@@ -3564,10 +3715,12 @@
         </w:rPr>
         <w:t xml:space="preserve">URL: </w:t>
       </w:r>
-      <w:hyperlink r:id="rId52">
+      <w:hyperlink r:id="rId53">
         <w:r>
           <w:rPr>
             <w:color w:val="0563c1"/>
+            <w:sz w:val="16"/>
+            <w:szCs w:val="16"/>
             <w:u w:val="single"/>
             <w:rtl w:val="0"/>
           </w:rPr>
@@ -3635,10 +3788,12 @@
         </w:rPr>
         <w:t xml:space="preserve">URL: </w:t>
       </w:r>
-      <w:hyperlink r:id="rId53">
+      <w:hyperlink r:id="rId54">
         <w:r>
           <w:rPr>
             <w:color w:val="0563c1"/>
+            <w:sz w:val="16"/>
+            <w:szCs w:val="16"/>
             <w:u w:val="single"/>
             <w:rtl w:val="0"/>
           </w:rPr>
@@ -3706,10 +3861,12 @@
         </w:rPr>
         <w:t xml:space="preserve">URL: </w:t>
       </w:r>
-      <w:hyperlink r:id="rId54">
+      <w:hyperlink r:id="rId55">
         <w:r>
           <w:rPr>
             <w:color w:val="0563c1"/>
+            <w:sz w:val="16"/>
+            <w:szCs w:val="16"/>
             <w:u w:val="single"/>
             <w:rtl w:val="0"/>
           </w:rPr>
@@ -3789,10 +3946,12 @@
         </w:rPr>
         <w:t xml:space="preserve">URL: </w:t>
       </w:r>
-      <w:hyperlink r:id="rId55">
+      <w:hyperlink r:id="rId56">
         <w:r>
           <w:rPr>
             <w:color w:val="0563c1"/>
+            <w:sz w:val="16"/>
+            <w:szCs w:val="16"/>
             <w:u w:val="single"/>
             <w:rtl w:val="0"/>
           </w:rPr>
@@ -3860,10 +4019,12 @@
         </w:rPr>
         <w:t xml:space="preserve">URL: </w:t>
       </w:r>
-      <w:hyperlink r:id="rId56">
+      <w:hyperlink r:id="rId57">
         <w:r>
           <w:rPr>
             <w:color w:val="0563c1"/>
+            <w:sz w:val="16"/>
+            <w:szCs w:val="16"/>
             <w:u w:val="single"/>
             <w:rtl w:val="0"/>
           </w:rPr>
@@ -3939,7 +4100,7 @@
     </w:p>
     <w:p>
       <w:pPr>
-        <w:spacing w:after="20" w:lineRule="auto"/>
+        <w:spacing w:after="0" w:lineRule="auto"/>
         <w:ind w:left="173" w:firstLine="0"/>
         <w:rPr/>
       </w:pPr>
@@ -3951,10 +4112,12 @@
         </w:rPr>
         <w:t xml:space="preserve">URL: </w:t>
       </w:r>
-      <w:hyperlink r:id="rId57">
+      <w:hyperlink r:id="rId58">
         <w:r>
           <w:rPr>
             <w:color w:val="0563c1"/>
+            <w:sz w:val="16"/>
+            <w:szCs w:val="16"/>
             <w:u w:val="single"/>
             <w:rtl w:val="0"/>
           </w:rPr>
@@ -3981,10 +4144,12 @@
         </w:rPr>
         <w:t xml:space="preserve">URL: </w:t>
       </w:r>
-      <w:hyperlink r:id="rId58">
+      <w:hyperlink r:id="rId59">
         <w:r>
           <w:rPr>
             <w:color w:val="0563c1"/>
+            <w:sz w:val="16"/>
+            <w:szCs w:val="16"/>
             <w:u w:val="single"/>
             <w:rtl w:val="0"/>
           </w:rPr>
@@ -4052,10 +4217,12 @@
         </w:rPr>
         <w:t xml:space="preserve">URL: </w:t>
       </w:r>
-      <w:hyperlink r:id="rId59">
+      <w:hyperlink r:id="rId60">
         <w:r>
           <w:rPr>
             <w:color w:val="0563c1"/>
+            <w:sz w:val="16"/>
+            <w:szCs w:val="16"/>
             <w:u w:val="single"/>
             <w:rtl w:val="0"/>
           </w:rPr>
@@ -4123,10 +4290,12 @@
         </w:rPr>
         <w:t xml:space="preserve">URL: </w:t>
       </w:r>
-      <w:hyperlink r:id="rId60">
+      <w:hyperlink r:id="rId61">
         <w:r>
           <w:rPr>
             <w:color w:val="0563c1"/>
+            <w:sz w:val="16"/>
+            <w:szCs w:val="16"/>
             <w:u w:val="single"/>
             <w:rtl w:val="0"/>
           </w:rPr>
@@ -4222,7 +4391,7 @@
     </w:p>
     <w:p>
       <w:pPr>
-        <w:spacing w:after="20" w:lineRule="auto"/>
+        <w:spacing w:after="0" w:lineRule="auto"/>
         <w:ind w:left="173" w:firstLine="0"/>
         <w:rPr/>
       </w:pPr>
@@ -4234,10 +4403,12 @@
         </w:rPr>
         <w:t xml:space="preserve">URL: </w:t>
       </w:r>
-      <w:hyperlink r:id="rId61">
+      <w:hyperlink r:id="rId62">
         <w:r>
           <w:rPr>
             <w:color w:val="0563c1"/>
+            <w:sz w:val="16"/>
+            <w:szCs w:val="16"/>
             <w:u w:val="single"/>
             <w:rtl w:val="0"/>
           </w:rPr>
@@ -4252,7 +4423,7 @@
     </w:p>
     <w:p>
       <w:pPr>
-        <w:spacing w:after="20" w:lineRule="auto"/>
+        <w:spacing w:after="0" w:lineRule="auto"/>
         <w:ind w:left="173" w:firstLine="0"/>
         <w:rPr/>
       </w:pPr>
@@ -4264,10 +4435,12 @@
         </w:rPr>
         <w:t xml:space="preserve">URL: </w:t>
       </w:r>
-      <w:hyperlink r:id="rId62">
+      <w:hyperlink r:id="rId63">
         <w:r>
           <w:rPr>
             <w:color w:val="0563c1"/>
+            <w:sz w:val="16"/>
+            <w:szCs w:val="16"/>
             <w:u w:val="single"/>
             <w:rtl w:val="0"/>
           </w:rPr>
@@ -4294,10 +4467,12 @@
         </w:rPr>
         <w:t xml:space="preserve">URL: </w:t>
       </w:r>
-      <w:hyperlink r:id="rId63">
+      <w:hyperlink r:id="rId64">
         <w:r>
           <w:rPr>
             <w:color w:val="0563c1"/>
+            <w:sz w:val="16"/>
+            <w:szCs w:val="16"/>
             <w:u w:val="single"/>
             <w:rtl w:val="0"/>
           </w:rPr>
@@ -4365,10 +4540,12 @@
         </w:rPr>
         <w:t xml:space="preserve">URL: </w:t>
       </w:r>
-      <w:hyperlink r:id="rId64">
+      <w:hyperlink r:id="rId65">
         <w:r>
           <w:rPr>
             <w:color w:val="0563c1"/>
+            <w:sz w:val="16"/>
+            <w:szCs w:val="16"/>
             <w:u w:val="single"/>
             <w:rtl w:val="0"/>
           </w:rPr>
@@ -4436,10 +4613,12 @@
         </w:rPr>
         <w:t xml:space="preserve">URL: </w:t>
       </w:r>
-      <w:hyperlink r:id="rId65">
+      <w:hyperlink r:id="rId66">
         <w:r>
           <w:rPr>
             <w:color w:val="0563c1"/>
+            <w:sz w:val="16"/>
+            <w:szCs w:val="16"/>
             <w:u w:val="single"/>
             <w:rtl w:val="0"/>
           </w:rPr>
@@ -4507,10 +4686,12 @@
         </w:rPr>
         <w:t xml:space="preserve">URL: </w:t>
       </w:r>
-      <w:hyperlink r:id="rId66">
+      <w:hyperlink r:id="rId67">
         <w:r>
           <w:rPr>
             <w:color w:val="0563c1"/>
+            <w:sz w:val="16"/>
+            <w:szCs w:val="16"/>
             <w:u w:val="single"/>
             <w:rtl w:val="0"/>
           </w:rPr>
@@ -4578,10 +4759,12 @@
         </w:rPr>
         <w:t xml:space="preserve">URL: </w:t>
       </w:r>
-      <w:hyperlink r:id="rId67">
+      <w:hyperlink r:id="rId68">
         <w:r>
           <w:rPr>
             <w:color w:val="0563c1"/>
+            <w:sz w:val="16"/>
+            <w:szCs w:val="16"/>
             <w:u w:val="single"/>
             <w:rtl w:val="0"/>
           </w:rPr>
@@ -4661,10 +4844,12 @@
         </w:rPr>
         <w:t xml:space="preserve">URL: </w:t>
       </w:r>
-      <w:hyperlink r:id="rId68">
+      <w:hyperlink r:id="rId69">
         <w:r>
           <w:rPr>
             <w:color w:val="0563c1"/>
+            <w:sz w:val="16"/>
+            <w:szCs w:val="16"/>
             <w:u w:val="single"/>
             <w:rtl w:val="0"/>
           </w:rPr>
@@ -4732,10 +4917,12 @@
         </w:rPr>
         <w:t xml:space="preserve">URL: </w:t>
       </w:r>
-      <w:hyperlink r:id="rId69">
+      <w:hyperlink r:id="rId70">
         <w:r>
           <w:rPr>
             <w:color w:val="0563c1"/>
+            <w:sz w:val="16"/>
+            <w:szCs w:val="16"/>
             <w:u w:val="single"/>
             <w:rtl w:val="0"/>
           </w:rPr>
@@ -4803,10 +4990,12 @@
         </w:rPr>
         <w:t xml:space="preserve">URL: </w:t>
       </w:r>
-      <w:hyperlink r:id="rId70">
+      <w:hyperlink r:id="rId71">
         <w:r>
           <w:rPr>
             <w:color w:val="0563c1"/>
+            <w:sz w:val="16"/>
+            <w:szCs w:val="16"/>
             <w:u w:val="single"/>
             <w:rtl w:val="0"/>
           </w:rPr>
@@ -4874,10 +5063,12 @@
         </w:rPr>
         <w:t xml:space="preserve">URL: </w:t>
       </w:r>
-      <w:hyperlink r:id="rId71">
+      <w:hyperlink r:id="rId72">
         <w:r>
           <w:rPr>
             <w:color w:val="0563c1"/>
+            <w:sz w:val="16"/>
+            <w:szCs w:val="16"/>
             <w:u w:val="single"/>
             <w:rtl w:val="0"/>
           </w:rPr>
@@ -4934,6 +5125,7 @@
     <w:p>
       <w:pPr>
         <w:spacing w:after="0" w:before="0" w:lineRule="auto"/>
+        <w:ind w:left="173" w:firstLine="0"/>
         <w:rPr/>
       </w:pPr>
       <w:r>
@@ -4955,6 +5147,7 @@
     <w:p>
       <w:pPr>
         <w:spacing w:after="0" w:before="0" w:lineRule="auto"/>
+        <w:ind w:left="173" w:firstLine="0"/>
         <w:rPr/>
       </w:pPr>
       <w:r>
@@ -4967,7 +5160,7 @@
         </w:rPr>
         <w:t xml:space="preserve">URL: </w:t>
       </w:r>
-      <w:hyperlink r:id="rId72">
+      <w:hyperlink r:id="rId73">
         <w:r>
           <w:rPr>
             <w:b w:val="0"/>
@@ -5000,6 +5193,7 @@
     <w:p>
       <w:pPr>
         <w:spacing w:after="20" w:before="0" w:lineRule="auto"/>
+        <w:ind w:left="173" w:firstLine="0"/>
         <w:rPr/>
       </w:pPr>
       <w:r>
@@ -5012,7 +5206,7 @@
         </w:rPr>
         <w:t xml:space="preserve">URL: </w:t>
       </w:r>
-      <w:hyperlink r:id="rId73">
+      <w:hyperlink r:id="rId74">
         <w:r>
           <w:rPr>
             <w:b w:val="0"/>
@@ -5066,6 +5260,7 @@
     <w:p>
       <w:pPr>
         <w:spacing w:after="0" w:before="0" w:lineRule="auto"/>
+        <w:ind w:left="173" w:firstLine="0"/>
         <w:rPr/>
       </w:pPr>
       <w:r>
@@ -5087,6 +5282,7 @@
     <w:p>
       <w:pPr>
         <w:spacing w:after="20" w:before="0" w:lineRule="auto"/>
+        <w:ind w:left="173" w:firstLine="0"/>
         <w:rPr/>
       </w:pPr>
       <w:r>
@@ -5099,7 +5295,7 @@
         </w:rPr>
         <w:t xml:space="preserve">URL: </w:t>
       </w:r>
-      <w:hyperlink r:id="rId74">
+      <w:hyperlink r:id="rId75">
         <w:r>
           <w:rPr>
             <w:b w:val="0"/>
@@ -5153,6 +5349,7 @@
     <w:p>
       <w:pPr>
         <w:spacing w:after="0" w:before="0" w:lineRule="auto"/>
+        <w:ind w:left="173" w:firstLine="0"/>
         <w:rPr/>
       </w:pPr>
       <w:r>
@@ -5174,6 +5371,7 @@
     <w:p>
       <w:pPr>
         <w:spacing w:after="0" w:before="0" w:lineRule="auto"/>
+        <w:ind w:left="173" w:firstLine="0"/>
         <w:rPr/>
       </w:pPr>
       <w:r>
@@ -5186,7 +5384,7 @@
         </w:rPr>
         <w:t xml:space="preserve">URL: </w:t>
       </w:r>
-      <w:hyperlink r:id="rId75">
+      <w:hyperlink r:id="rId76">
         <w:r>
           <w:rPr>
             <w:b w:val="0"/>
@@ -5219,6 +5417,7 @@
     <w:p>
       <w:pPr>
         <w:spacing w:after="20" w:before="0" w:lineRule="auto"/>
+        <w:ind w:left="173" w:firstLine="0"/>
         <w:rPr/>
       </w:pPr>
       <w:r>
@@ -5231,7 +5430,7 @@
         </w:rPr>
         <w:t xml:space="preserve">URL: </w:t>
       </w:r>
-      <w:hyperlink r:id="rId76">
+      <w:hyperlink r:id="rId77">
         <w:r>
           <w:rPr>
             <w:b w:val="0"/>
@@ -5293,6 +5492,7 @@
     <w:p>
       <w:pPr>
         <w:spacing w:after="0" w:before="0" w:lineRule="auto"/>
+        <w:ind w:left="173" w:firstLine="0"/>
         <w:rPr/>
       </w:pPr>
       <w:r>
@@ -5314,6 +5514,7 @@
     <w:p>
       <w:pPr>
         <w:spacing w:after="0" w:before="0" w:lineRule="auto"/>
+        <w:ind w:left="173" w:firstLine="0"/>
         <w:rPr/>
       </w:pPr>
       <w:r>
@@ -5326,7 +5527,7 @@
         </w:rPr>
         <w:t xml:space="preserve">URL: </w:t>
       </w:r>
-      <w:hyperlink r:id="rId77">
+      <w:hyperlink r:id="rId78">
         <w:r>
           <w:rPr>
             <w:b w:val="0"/>
@@ -5359,6 +5560,7 @@
     <w:p>
       <w:pPr>
         <w:spacing w:after="0" w:before="0" w:lineRule="auto"/>
+        <w:ind w:left="173" w:firstLine="0"/>
         <w:rPr/>
       </w:pPr>
       <w:r>
@@ -5371,7 +5573,7 @@
         </w:rPr>
         <w:t xml:space="preserve">URL: </w:t>
       </w:r>
-      <w:hyperlink r:id="rId78">
+      <w:hyperlink r:id="rId79">
         <w:r>
           <w:rPr>
             <w:b w:val="0"/>
@@ -5404,6 +5606,7 @@
     <w:p>
       <w:pPr>
         <w:spacing w:after="20" w:before="0" w:lineRule="auto"/>
+        <w:ind w:left="173" w:firstLine="0"/>
         <w:rPr/>
       </w:pPr>
       <w:r>
@@ -5416,7 +5619,7 @@
         </w:rPr>
         <w:t xml:space="preserve">URL: </w:t>
       </w:r>
-      <w:hyperlink r:id="rId79">
+      <w:hyperlink r:id="rId80">
         <w:r>
           <w:rPr>
             <w:b w:val="0"/>
@@ -5478,6 +5681,7 @@
     <w:p>
       <w:pPr>
         <w:spacing w:after="0" w:before="0" w:lineRule="auto"/>
+        <w:ind w:left="173" w:firstLine="0"/>
         <w:rPr/>
       </w:pPr>
       <w:r>
@@ -5499,6 +5703,7 @@
     <w:p>
       <w:pPr>
         <w:spacing w:after="0" w:before="0" w:lineRule="auto"/>
+        <w:ind w:left="173" w:firstLine="0"/>
         <w:rPr/>
       </w:pPr>
       <w:r>
@@ -5511,7 +5716,7 @@
         </w:rPr>
         <w:t xml:space="preserve">URL: </w:t>
       </w:r>
-      <w:hyperlink r:id="rId80">
+      <w:hyperlink r:id="rId81">
         <w:r>
           <w:rPr>
             <w:b w:val="0"/>
@@ -5544,6 +5749,7 @@
     <w:p>
       <w:pPr>
         <w:spacing w:after="20" w:before="0" w:lineRule="auto"/>
+        <w:ind w:left="173" w:firstLine="0"/>
         <w:rPr/>
       </w:pPr>
       <w:r>
@@ -5556,7 +5762,7 @@
         </w:rPr>
         <w:t xml:space="preserve">URL: </w:t>
       </w:r>
-      <w:hyperlink r:id="rId81">
+      <w:hyperlink r:id="rId82">
         <w:r>
           <w:rPr>
             <w:b w:val="0"/>
@@ -5610,6 +5816,7 @@
     <w:p>
       <w:pPr>
         <w:spacing w:after="0" w:before="0" w:lineRule="auto"/>
+        <w:ind w:left="173" w:firstLine="0"/>
         <w:rPr/>
       </w:pPr>
       <w:r>
@@ -5631,6 +5838,7 @@
     <w:p>
       <w:pPr>
         <w:spacing w:after="20" w:before="0" w:lineRule="auto"/>
+        <w:ind w:left="173" w:firstLine="0"/>
         <w:rPr/>
       </w:pPr>
       <w:r>
@@ -5643,7 +5851,7 @@
         </w:rPr>
         <w:t xml:space="preserve">URL: </w:t>
       </w:r>
-      <w:hyperlink r:id="rId82">
+      <w:hyperlink r:id="rId83">
         <w:r>
           <w:rPr>
             <w:b w:val="0"/>
@@ -5697,6 +5905,7 @@
     <w:p>
       <w:pPr>
         <w:spacing w:after="0" w:before="0" w:lineRule="auto"/>
+        <w:ind w:left="173" w:firstLine="0"/>
         <w:rPr/>
       </w:pPr>
       <w:r>
@@ -5718,6 +5927,7 @@
     <w:p>
       <w:pPr>
         <w:spacing w:after="20" w:before="0" w:lineRule="auto"/>
+        <w:ind w:left="173" w:firstLine="0"/>
         <w:rPr/>
       </w:pPr>
       <w:r>
@@ -5730,7 +5940,7 @@
         </w:rPr>
         <w:t xml:space="preserve">URL: </w:t>
       </w:r>
-      <w:hyperlink r:id="rId83">
+      <w:hyperlink r:id="rId84">
         <w:r>
           <w:rPr>
             <w:b w:val="0"/>
@@ -5827,10 +6037,12 @@
         </w:rPr>
         <w:t xml:space="preserve">URL: </w:t>
       </w:r>
-      <w:hyperlink r:id="rId84">
+      <w:hyperlink r:id="rId85">
         <w:r>
           <w:rPr>
             <w:color w:val="0563c1"/>
+            <w:sz w:val="16"/>
+            <w:szCs w:val="16"/>
             <w:u w:val="single"/>
             <w:rtl w:val="0"/>
           </w:rPr>
@@ -5898,10 +6110,12 @@
         </w:rPr>
         <w:t xml:space="preserve">URL: </w:t>
       </w:r>
-      <w:hyperlink r:id="rId85">
+      <w:hyperlink r:id="rId86">
         <w:r>
           <w:rPr>
             <w:color w:val="0563c1"/>
+            <w:sz w:val="16"/>
+            <w:szCs w:val="16"/>
             <w:u w:val="single"/>
             <w:rtl w:val="0"/>
           </w:rPr>
@@ -5969,10 +6183,12 @@
         </w:rPr>
         <w:t xml:space="preserve">URL: </w:t>
       </w:r>
-      <w:hyperlink r:id="rId86">
+      <w:hyperlink r:id="rId87">
         <w:r>
           <w:rPr>
             <w:color w:val="0563c1"/>
+            <w:sz w:val="16"/>
+            <w:szCs w:val="16"/>
             <w:u w:val="single"/>
             <w:rtl w:val="0"/>
           </w:rPr>
@@ -6040,10 +6256,12 @@
         </w:rPr>
         <w:t xml:space="preserve">URL: </w:t>
       </w:r>
-      <w:hyperlink r:id="rId87">
+      <w:hyperlink r:id="rId88">
         <w:r>
           <w:rPr>
             <w:color w:val="0563c1"/>
+            <w:sz w:val="16"/>
+            <w:szCs w:val="16"/>
             <w:u w:val="single"/>
             <w:rtl w:val="0"/>
           </w:rPr>
@@ -6123,10 +6341,12 @@
         </w:rPr>
         <w:t xml:space="preserve">URL: </w:t>
       </w:r>
-      <w:hyperlink r:id="rId88">
+      <w:hyperlink r:id="rId89">
         <w:r>
           <w:rPr>
             <w:color w:val="0563c1"/>
+            <w:sz w:val="16"/>
+            <w:szCs w:val="16"/>
             <w:u w:val="single"/>
             <w:rtl w:val="0"/>
           </w:rPr>
@@ -6194,10 +6414,12 @@
         </w:rPr>
         <w:t xml:space="preserve">URL: </w:t>
       </w:r>
-      <w:hyperlink r:id="rId89">
+      <w:hyperlink r:id="rId90">
         <w:r>
           <w:rPr>
             <w:color w:val="0563c1"/>
+            <w:sz w:val="16"/>
+            <w:szCs w:val="16"/>
             <w:u w:val="single"/>
             <w:rtl w:val="0"/>
           </w:rPr>
@@ -6265,10 +6487,12 @@
         </w:rPr>
         <w:t xml:space="preserve">URL: </w:t>
       </w:r>
-      <w:hyperlink r:id="rId90">
+      <w:hyperlink r:id="rId91">
         <w:r>
           <w:rPr>
             <w:color w:val="0563c1"/>
+            <w:sz w:val="16"/>
+            <w:szCs w:val="16"/>
             <w:u w:val="single"/>
             <w:rtl w:val="0"/>
           </w:rPr>
@@ -6336,10 +6560,12 @@
         </w:rPr>
         <w:t xml:space="preserve">URL: </w:t>
       </w:r>
-      <w:hyperlink r:id="rId91">
+      <w:hyperlink r:id="rId92">
         <w:r>
           <w:rPr>
             <w:color w:val="0563c1"/>
+            <w:sz w:val="16"/>
+            <w:szCs w:val="16"/>
             <w:u w:val="single"/>
             <w:rtl w:val="0"/>
           </w:rPr>
@@ -15397,9 +15623,9 @@
       </w:r>
     </w:p>
     <w:sectPr>
-      <w:footerReference r:id="rId92" w:type="default"/>
+      <w:footerReference r:id="rId93" w:type="default"/>
       <w:pgSz w:h="15840" w:w="12240" w:orient="portrait"/>
-      <w:pgMar w:bottom="936" w:top="936" w:left="1037" w:right="1037" w:header="720" w:footer="720"/>
+      <w:pgMar w:bottom="936" w:top="936" w:left="1037" w:right="1037" w:header="720" w:footer="173"/>
       <w:pgNumType w:start="1"/>
     </w:sectPr>
   </w:body>
@@ -15412,7 +15638,8 @@
     <w:pPr>
       <w:keepNext w:val="0"/>
       <w:keepLines w:val="0"/>
-      <w:widowControl w:val="1"/>
+      <w:pageBreakBefore w:val="0"/>
+      <w:widowControl w:val="0"/>
       <w:pBdr>
         <w:top w:space="0" w:sz="0" w:val="nil"/>
         <w:left w:space="0" w:sz="0" w:val="nil"/>
@@ -15421,48 +15648,156 @@
         <w:between w:space="0" w:sz="0" w:val="nil"/>
       </w:pBdr>
       <w:shd w:fill="auto" w:val="clear"/>
-      <w:tabs>
-        <w:tab w:val="center" w:leader="none" w:pos="4680"/>
-        <w:tab w:val="right" w:leader="none" w:pos="9360"/>
-      </w:tabs>
-      <w:spacing w:after="0" w:before="0" w:line="240" w:lineRule="auto"/>
+      <w:spacing w:after="0" w:before="0" w:line="276" w:lineRule="auto"/>
       <w:ind w:left="0" w:right="0" w:firstLine="0"/>
-      <w:jc w:val="center"/>
-      <w:rPr>
-        <w:rFonts w:ascii="Arial" w:cs="Arial" w:eastAsia="Arial" w:hAnsi="Arial"/>
-        <w:b w:val="0"/>
-        <w:bCs w:val="0"/>
-        <w:i w:val="0"/>
-        <w:iCs w:val="0"/>
-        <w:smallCaps w:val="0"/>
-        <w:strike w:val="0"/>
-        <w:color w:val="000000"/>
-        <w:sz w:val="19"/>
-        <w:szCs w:val="19"/>
-        <w:u w:val="none"/>
-        <w:shd w:fill="auto" w:val="clear"/>
-        <w:vertAlign w:val="baseline"/>
-      </w:rPr>
+      <w:jc w:val="left"/>
+      <w:rPr/>
     </w:pPr>
     <w:r>
       <w:rPr>
-        <w:rFonts w:ascii="Arial" w:cs="Arial" w:eastAsia="Arial" w:hAnsi="Arial"/>
-        <w:b w:val="0"/>
-        <w:bCs w:val="0"/>
-        <w:i w:val="0"/>
-        <w:iCs w:val="0"/>
-        <w:smallCaps w:val="0"/>
-        <w:strike w:val="0"/>
-        <w:color w:val="000000"/>
-        <w:sz w:val="15"/>
-        <w:szCs w:val="15"/>
-        <w:u w:val="none"/>
-        <w:shd w:fill="auto" w:val="clear"/>
-        <w:vertAlign w:val="baseline"/>
         <w:rtl w:val="0"/>
       </w:rPr>
-      <w:t xml:space="preserve">The Evidence for Veganism — Scientific Evidence Library</w:t>
     </w:r>
+  </w:p>
+  <w:tbl>
+    <w:tblPr>
+      <w:tblStyle w:val="Table1"/>
+      <w:tblW w:w="2218.0" w:type="dxa"/>
+      <w:jc w:val="right"/>
+      <w:tblBorders>
+        <w:top w:color="000000" w:space="0" w:sz="0" w:val="nil"/>
+        <w:left w:color="000000" w:space="0" w:sz="0" w:val="nil"/>
+        <w:bottom w:color="000000" w:space="0" w:sz="0" w:val="nil"/>
+        <w:right w:color="000000" w:space="0" w:sz="0" w:val="nil"/>
+        <w:insideH w:color="000000" w:space="0" w:sz="0" w:val="nil"/>
+        <w:insideV w:color="000000" w:space="0" w:sz="0" w:val="nil"/>
+      </w:tblBorders>
+      <w:tblLayout w:type="fixed"/>
+      <w:tblLook w:val="0400"/>
+    </w:tblPr>
+    <w:tblGrid>
+      <w:gridCol w:w="1325"/>
+      <w:gridCol w:w="893"/>
+      <w:tblGridChange w:id="0">
+        <w:tblGrid>
+          <w:gridCol w:w="1325"/>
+          <w:gridCol w:w="893"/>
+        </w:tblGrid>
+      </w:tblGridChange>
+    </w:tblGrid>
+    <w:tr>
+      <w:trPr>
+        <w:cantSplit w:val="0"/>
+        <w:tblHeader w:val="0"/>
+      </w:trPr>
+      <w:tc>
+        <w:tcPr>
+          <w:tcMar>
+            <w:top w:w="0.0" w:type="dxa"/>
+            <w:left w:w="0.0" w:type="dxa"/>
+            <w:bottom w:w="0.0" w:type="dxa"/>
+            <w:right w:w="0.0" w:type="dxa"/>
+          </w:tcMar>
+          <w:vAlign w:val="center"/>
+        </w:tcPr>
+        <w:p>
+          <w:pPr>
+            <w:spacing w:after="0" w:line="216" w:lineRule="auto"/>
+            <w:jc w:val="right"/>
+            <w:rPr/>
+          </w:pPr>
+          <w:r>
+            <w:rPr>
+              <w:b w:val="1"/>
+              <w:bCs w:val="1"/>
+              <w:color w:val="236941"/>
+              <w:sz w:val="15"/>
+              <w:szCs w:val="15"/>
+              <w:rtl w:val="0"/>
+            </w:rPr>
+            <w:t xml:space="preserve">GO VEGAN</w:t>
+            <w:br w:type="textWrapping"/>
+          </w:r>
+          <w:r>
+            <w:rPr>
+              <w:sz w:val="13"/>
+              <w:szCs w:val="13"/>
+              <w:rtl w:val="0"/>
+            </w:rPr>
+            <w:t xml:space="preserve">Scan to visit</w:t>
+          </w:r>
+          <w:r>
+            <w:rPr>
+              <w:rtl w:val="0"/>
+            </w:rPr>
+          </w:r>
+        </w:p>
+      </w:tc>
+      <w:tc>
+        <w:tcPr>
+          <w:tcMar>
+            <w:top w:w="0.0" w:type="dxa"/>
+            <w:left w:w="0.0" w:type="dxa"/>
+            <w:bottom w:w="0.0" w:type="dxa"/>
+            <w:right w:w="0.0" w:type="dxa"/>
+          </w:tcMar>
+          <w:vAlign w:val="center"/>
+        </w:tcPr>
+        <w:p>
+          <w:pPr>
+            <w:spacing w:after="0" w:lineRule="auto"/>
+            <w:jc w:val="right"/>
+            <w:rPr/>
+          </w:pPr>
+          <w:r>
+            <w:rPr/>
+            <w:drawing>
+              <wp:inline distB="0" distT="0" distL="114300" distR="114300">
+                <wp:extent cx="512064" cy="512064"/>
+                <wp:effectExtent b="0" l="0" r="0" t="0"/>
+                <wp:docPr id="1" name="image1.png"/>
+                <a:graphic>
+                  <a:graphicData uri="http://schemas.openxmlformats.org/drawingml/2006/picture">
+                    <pic:pic>
+                      <pic:nvPicPr>
+                        <pic:cNvPr id="0" name="image1.png"/>
+                        <pic:cNvPicPr preferRelativeResize="0"/>
+                      </pic:nvPicPr>
+                      <pic:blipFill>
+                        <a:blip r:embed="rId1"/>
+                        <a:srcRect b="0" l="0" r="0" t="0"/>
+                        <a:stretch>
+                          <a:fillRect/>
+                        </a:stretch>
+                      </pic:blipFill>
+                      <pic:spPr>
+                        <a:xfrm>
+                          <a:off x="0" y="0"/>
+                          <a:ext cx="512064" cy="512064"/>
+                        </a:xfrm>
+                        <a:prstGeom prst="rect"/>
+                        <a:ln/>
+                      </pic:spPr>
+                    </pic:pic>
+                  </a:graphicData>
+                </a:graphic>
+              </wp:inline>
+            </w:drawing>
+          </w:r>
+          <w:r>
+            <w:rPr>
+              <w:rtl w:val="0"/>
+            </w:rPr>
+          </w:r>
+        </w:p>
+      </w:tc>
+    </w:tr>
+  </w:tbl>
+  <w:p>
+    <w:pPr>
+      <w:spacing w:after="0" w:before="0" w:line="24" w:lineRule="auto"/>
+      <w:rPr/>
+    </w:pPr>
     <w:r>
       <w:rPr>
         <w:rtl w:val="0"/>
@@ -15641,6 +15976,19 @@
       <w:sz w:val="22"/>
       <w:szCs w:val="22"/>
     </w:rPr>
+  </w:style>
+  <w:style w:type="table" w:styleId="Table1">
+    <w:basedOn w:val="TableNormal"/>
+    <w:tblPr>
+      <w:tblStyleRowBandSize w:val="1"/>
+      <w:tblStyleColBandSize w:val="1"/>
+      <w:tblCellMar>
+        <w:top w:w="0.0" w:type="dxa"/>
+        <w:left w:w="115.0" w:type="dxa"/>
+        <w:bottom w:w="0.0" w:type="dxa"/>
+        <w:right w:w="115.0" w:type="dxa"/>
+      </w:tblCellMar>
+    </w:tblPr>
   </w:style>
 </w:styles>
 </file>

</xml_diff>